<commit_message>
dodajanje nove verzije naloge za srecanje4
</commit_message>
<xml_diff>
--- a/srecanje4/srecanje4_naloga.docx
+++ b/srecanje4/srecanje4_naloga.docx
@@ -44,6 +44,9 @@
     </w:p>
     <w:p>
       <w:r>
+        <w:rPr>
+          <w:noProof/>
+        </w:rPr>
         <w:drawing>
           <wp:inline distT="0" distB="0" distL="0" distR="0" wp14:anchorId="300D1794" wp14:editId="6E961A3D">
             <wp:extent cx="5760720" cy="3067685"/>
@@ -60,7 +63,7 @@
                     <pic:cNvPicPr/>
                   </pic:nvPicPr>
                   <pic:blipFill>
-                    <a:blip r:embed="rId4"/>
+                    <a:blip r:embed="rId5"/>
                     <a:stretch>
                       <a:fillRect/>
                     </a:stretch>
@@ -81,6 +84,1649 @@
         </w:drawing>
       </w:r>
     </w:p>
+    <w:p>
+      <w:r>
+        <w:t xml:space="preserve">Ustvaril sem potrebne mape z ukazom </w:t>
+      </w:r>
+      <w:proofErr w:type="spellStart"/>
+      <w:r>
+        <w:t>mkdir</w:t>
+      </w:r>
+      <w:proofErr w:type="spellEnd"/>
+    </w:p>
+    <w:p>
+      <w:r>
+        <w:drawing>
+          <wp:inline distT="0" distB="0" distL="0" distR="0" wp14:anchorId="576DED49" wp14:editId="4751B07D">
+            <wp:extent cx="5760720" cy="2348865"/>
+            <wp:effectExtent l="0" t="0" r="0" b="0"/>
+            <wp:docPr id="1549896959" name="Slika 1"/>
+            <wp:cNvGraphicFramePr>
+              <a:graphicFrameLocks xmlns:a="http://schemas.openxmlformats.org/drawingml/2006/main" noChangeAspect="1"/>
+            </wp:cNvGraphicFramePr>
+            <a:graphic xmlns:a="http://schemas.openxmlformats.org/drawingml/2006/main">
+              <a:graphicData uri="http://schemas.openxmlformats.org/drawingml/2006/picture">
+                <pic:pic xmlns:pic="http://schemas.openxmlformats.org/drawingml/2006/picture">
+                  <pic:nvPicPr>
+                    <pic:cNvPr id="1549896959" name=""/>
+                    <pic:cNvPicPr/>
+                  </pic:nvPicPr>
+                  <pic:blipFill>
+                    <a:blip r:embed="rId6"/>
+                    <a:stretch>
+                      <a:fillRect/>
+                    </a:stretch>
+                  </pic:blipFill>
+                  <pic:spPr>
+                    <a:xfrm>
+                      <a:off x="0" y="0"/>
+                      <a:ext cx="5760720" cy="2348865"/>
+                    </a:xfrm>
+                    <a:prstGeom prst="rect">
+                      <a:avLst/>
+                    </a:prstGeom>
+                  </pic:spPr>
+                </pic:pic>
+              </a:graphicData>
+            </a:graphic>
+          </wp:inline>
+        </w:drawing>
+      </w:r>
+    </w:p>
+    <w:p>
+      <w:r>
+        <w:t xml:space="preserve">Najprej sem v mape vstavil naloge, ki sem jih že opravi in nato sem ustvaril </w:t>
+      </w:r>
+      <w:proofErr w:type="spellStart"/>
+      <w:r>
+        <w:t>commit</w:t>
+      </w:r>
+      <w:proofErr w:type="spellEnd"/>
+      <w:r>
+        <w:t xml:space="preserve">. </w:t>
+      </w:r>
+    </w:p>
+    <w:p>
+      <w:r>
+        <w:t xml:space="preserve">Nato sem naredil nov </w:t>
+      </w:r>
+      <w:proofErr w:type="spellStart"/>
+      <w:r>
+        <w:t>repozitoriv</w:t>
+      </w:r>
+      <w:proofErr w:type="spellEnd"/>
+      <w:r>
+        <w:t xml:space="preserve"> na </w:t>
+      </w:r>
+      <w:proofErr w:type="spellStart"/>
+      <w:r>
+        <w:t>Githubu</w:t>
+      </w:r>
+      <w:proofErr w:type="spellEnd"/>
+      <w:r>
+        <w:t xml:space="preserve"> in ga poimenoval po </w:t>
+      </w:r>
+      <w:proofErr w:type="spellStart"/>
+      <w:r>
+        <w:t>naovdilih</w:t>
+      </w:r>
+      <w:proofErr w:type="spellEnd"/>
+      <w:r>
+        <w:t xml:space="preserve">. </w:t>
+      </w:r>
+    </w:p>
+    <w:p>
+      <w:r>
+        <w:t xml:space="preserve">Nato sem lokalni </w:t>
+      </w:r>
+      <w:proofErr w:type="spellStart"/>
+      <w:r>
+        <w:t>repozitorij</w:t>
+      </w:r>
+      <w:proofErr w:type="spellEnd"/>
+      <w:r>
+        <w:t xml:space="preserve"> povezal z </w:t>
+      </w:r>
+      <w:proofErr w:type="spellStart"/>
+      <w:r>
+        <w:t>Github</w:t>
+      </w:r>
+      <w:proofErr w:type="spellEnd"/>
+      <w:r>
+        <w:t xml:space="preserve"> </w:t>
+      </w:r>
+      <w:proofErr w:type="spellStart"/>
+      <w:r>
+        <w:t>repozitorijem</w:t>
+      </w:r>
+      <w:proofErr w:type="spellEnd"/>
+      <w:r>
+        <w:t xml:space="preserve"> in prenesel te datoteke na </w:t>
+      </w:r>
+      <w:proofErr w:type="spellStart"/>
+      <w:r>
+        <w:t>Github</w:t>
+      </w:r>
+      <w:proofErr w:type="spellEnd"/>
+      <w:r>
+        <w:t>.</w:t>
+      </w:r>
+    </w:p>
+    <w:p/>
+    <w:p>
+      <w:r>
+        <w:lastRenderedPageBreak/>
+        <w:drawing>
+          <wp:inline distT="0" distB="0" distL="0" distR="0" wp14:anchorId="4581F3D2" wp14:editId="041F06D4">
+            <wp:extent cx="5760720" cy="3127375"/>
+            <wp:effectExtent l="0" t="0" r="0" b="0"/>
+            <wp:docPr id="750167914" name="Slika 1"/>
+            <wp:cNvGraphicFramePr>
+              <a:graphicFrameLocks xmlns:a="http://schemas.openxmlformats.org/drawingml/2006/main" noChangeAspect="1"/>
+            </wp:cNvGraphicFramePr>
+            <a:graphic xmlns:a="http://schemas.openxmlformats.org/drawingml/2006/main">
+              <a:graphicData uri="http://schemas.openxmlformats.org/drawingml/2006/picture">
+                <pic:pic xmlns:pic="http://schemas.openxmlformats.org/drawingml/2006/picture">
+                  <pic:nvPicPr>
+                    <pic:cNvPr id="750167914" name=""/>
+                    <pic:cNvPicPr/>
+                  </pic:nvPicPr>
+                  <pic:blipFill>
+                    <a:blip r:embed="rId7"/>
+                    <a:stretch>
+                      <a:fillRect/>
+                    </a:stretch>
+                  </pic:blipFill>
+                  <pic:spPr>
+                    <a:xfrm>
+                      <a:off x="0" y="0"/>
+                      <a:ext cx="5760720" cy="3127375"/>
+                    </a:xfrm>
+                    <a:prstGeom prst="rect">
+                      <a:avLst/>
+                    </a:prstGeom>
+                  </pic:spPr>
+                </pic:pic>
+              </a:graphicData>
+            </a:graphic>
+          </wp:inline>
+        </w:drawing>
+      </w:r>
+    </w:p>
+    <w:p/>
+    <w:p>
+      <w:r>
+        <w:drawing>
+          <wp:inline distT="0" distB="0" distL="0" distR="0" wp14:anchorId="7FF84693" wp14:editId="3CE2BD08">
+            <wp:extent cx="5760720" cy="2984500"/>
+            <wp:effectExtent l="0" t="0" r="0" b="6350"/>
+            <wp:docPr id="910176526" name="Slika 1"/>
+            <wp:cNvGraphicFramePr>
+              <a:graphicFrameLocks xmlns:a="http://schemas.openxmlformats.org/drawingml/2006/main" noChangeAspect="1"/>
+            </wp:cNvGraphicFramePr>
+            <a:graphic xmlns:a="http://schemas.openxmlformats.org/drawingml/2006/main">
+              <a:graphicData uri="http://schemas.openxmlformats.org/drawingml/2006/picture">
+                <pic:pic xmlns:pic="http://schemas.openxmlformats.org/drawingml/2006/picture">
+                  <pic:nvPicPr>
+                    <pic:cNvPr id="910176526" name=""/>
+                    <pic:cNvPicPr/>
+                  </pic:nvPicPr>
+                  <pic:blipFill>
+                    <a:blip r:embed="rId8"/>
+                    <a:stretch>
+                      <a:fillRect/>
+                    </a:stretch>
+                  </pic:blipFill>
+                  <pic:spPr>
+                    <a:xfrm>
+                      <a:off x="0" y="0"/>
+                      <a:ext cx="5760720" cy="2984500"/>
+                    </a:xfrm>
+                    <a:prstGeom prst="rect">
+                      <a:avLst/>
+                    </a:prstGeom>
+                  </pic:spPr>
+                </pic:pic>
+              </a:graphicData>
+            </a:graphic>
+          </wp:inline>
+        </w:drawing>
+      </w:r>
+    </w:p>
+    <w:p>
+      <w:r>
+        <w:t xml:space="preserve">Tukaj vidimo da so vse datoteke pravilno prenesle na </w:t>
+      </w:r>
+      <w:proofErr w:type="spellStart"/>
+      <w:r>
+        <w:t>GitHub</w:t>
+      </w:r>
+      <w:proofErr w:type="spellEnd"/>
+      <w:r>
+        <w:t xml:space="preserve"> </w:t>
+      </w:r>
+      <w:proofErr w:type="spellStart"/>
+      <w:r>
+        <w:t>repozitorij</w:t>
+      </w:r>
+      <w:proofErr w:type="spellEnd"/>
+      <w:r>
+        <w:t>.</w:t>
+      </w:r>
+    </w:p>
+    <w:p/>
+    <w:p>
+      <w:pPr>
+        <w:rPr>
+          <w:b/>
+          <w:bCs/>
+        </w:rPr>
+      </w:pPr>
+      <w:r>
+        <w:rPr>
+          <w:b/>
+          <w:bCs/>
+        </w:rPr>
+        <w:t>2. Branje dokumenta</w:t>
+      </w:r>
+    </w:p>
+    <w:p>
+      <w:r>
+        <w:t xml:space="preserve">Preberite priložen dokument </w:t>
+      </w:r>
+      <w:r>
+        <w:rPr>
+          <w:b/>
+          <w:bCs/>
+        </w:rPr>
+        <w:t>(koda: 9123)</w:t>
+      </w:r>
+      <w:r>
+        <w:t>.</w:t>
+      </w:r>
+    </w:p>
+    <w:p>
+      <w:r>
+        <w:t xml:space="preserve">Priporočam, da si dokument </w:t>
+      </w:r>
+      <w:r>
+        <w:rPr>
+          <w:b/>
+          <w:bCs/>
+        </w:rPr>
+        <w:t>natisnete</w:t>
+      </w:r>
+      <w:r>
+        <w:t xml:space="preserve"> in ga preberete </w:t>
+      </w:r>
+      <w:r>
+        <w:rPr>
+          <w:b/>
+          <w:bCs/>
+        </w:rPr>
+        <w:t>vsaj dvakrat</w:t>
+      </w:r>
+      <w:r>
+        <w:t>.</w:t>
+      </w:r>
+    </w:p>
+    <w:p>
+      <w:pPr>
+        <w:rPr>
+          <w:b/>
+          <w:bCs/>
+        </w:rPr>
+      </w:pPr>
+      <w:r>
+        <w:rPr>
+          <w:b/>
+          <w:bCs/>
+        </w:rPr>
+        <w:t>a)</w:t>
+      </w:r>
+    </w:p>
+    <w:p>
+      <w:r>
+        <w:t>Med branjem označujte dele, ki jih ne razumete.</w:t>
+      </w:r>
+      <w:r>
+        <w:br/>
+        <w:t>Zapišite:</w:t>
+      </w:r>
+    </w:p>
+    <w:p>
+      <w:pPr>
+        <w:numPr>
+          <w:ilvl w:val="0"/>
+          <w:numId w:val="1"/>
+        </w:numPr>
+      </w:pPr>
+      <w:r>
+        <w:rPr>
+          <w:b/>
+          <w:bCs/>
+        </w:rPr>
+        <w:lastRenderedPageBreak/>
+        <w:t>stran</w:t>
+      </w:r>
+    </w:p>
+    <w:p>
+      <w:pPr>
+        <w:numPr>
+          <w:ilvl w:val="0"/>
+          <w:numId w:val="1"/>
+        </w:numPr>
+      </w:pPr>
+      <w:r>
+        <w:rPr>
+          <w:b/>
+          <w:bCs/>
+        </w:rPr>
+        <w:t>odsek</w:t>
+      </w:r>
+    </w:p>
+    <w:p>
+      <w:r>
+        <w:t xml:space="preserve">Vsak mora označiti </w:t>
+      </w:r>
+      <w:r>
+        <w:rPr>
+          <w:b/>
+          <w:bCs/>
+        </w:rPr>
+        <w:t>vsaj 5 delov</w:t>
+      </w:r>
+      <w:r>
+        <w:t xml:space="preserve">, ki so manj razumljivi, in zapisati </w:t>
+      </w:r>
+      <w:r>
+        <w:rPr>
+          <w:b/>
+          <w:bCs/>
+        </w:rPr>
+        <w:t>vsaj 5 vprašanj</w:t>
+      </w:r>
+      <w:r>
+        <w:t>.</w:t>
+      </w:r>
+    </w:p>
+    <w:p>
+      <w:pPr>
+        <w:pStyle w:val="Odstavekseznama"/>
+        <w:numPr>
+          <w:ilvl w:val="0"/>
+          <w:numId w:val="9"/>
+        </w:numPr>
+      </w:pPr>
+      <w:r>
+        <w:t xml:space="preserve">stran 3, </w:t>
+      </w:r>
+      <w:proofErr w:type="spellStart"/>
+      <w:r>
+        <w:t>Virtualization</w:t>
+      </w:r>
+      <w:proofErr w:type="spellEnd"/>
+      <w:r>
+        <w:t xml:space="preserve">. </w:t>
+      </w:r>
+    </w:p>
+    <w:p>
+      <w:r>
+        <w:t xml:space="preserve">Vprašanje: Kakšno vlogo ima </w:t>
+      </w:r>
+      <w:proofErr w:type="spellStart"/>
+      <w:r>
+        <w:t>hypervisor</w:t>
+      </w:r>
+      <w:proofErr w:type="spellEnd"/>
+      <w:r>
+        <w:t xml:space="preserve"> pri virtualnih računalnik, zakaj je sploh pomemben za ?</w:t>
+      </w:r>
+    </w:p>
+    <w:p>
+      <w:pPr>
+        <w:pStyle w:val="Odstavekseznama"/>
+        <w:numPr>
+          <w:ilvl w:val="0"/>
+          <w:numId w:val="9"/>
+        </w:numPr>
+      </w:pPr>
+      <w:r>
+        <w:t xml:space="preserve">stran 3-4, </w:t>
+      </w:r>
+      <w:proofErr w:type="spellStart"/>
+      <w:r>
+        <w:t>Resources</w:t>
+      </w:r>
+      <w:proofErr w:type="spellEnd"/>
+      <w:r>
+        <w:t xml:space="preserve"> (</w:t>
+      </w:r>
+      <w:proofErr w:type="spellStart"/>
+      <w:r>
+        <w:t>compute</w:t>
+      </w:r>
+      <w:proofErr w:type="spellEnd"/>
+      <w:r>
+        <w:t xml:space="preserve">, </w:t>
+      </w:r>
+      <w:proofErr w:type="spellStart"/>
+      <w:r>
+        <w:t>storage</w:t>
+      </w:r>
+      <w:proofErr w:type="spellEnd"/>
+      <w:r>
+        <w:t xml:space="preserve">, </w:t>
+      </w:r>
+      <w:proofErr w:type="spellStart"/>
+      <w:r>
+        <w:t>database</w:t>
+      </w:r>
+      <w:proofErr w:type="spellEnd"/>
+      <w:r>
+        <w:t xml:space="preserve">, </w:t>
+      </w:r>
+      <w:proofErr w:type="spellStart"/>
+      <w:r>
+        <w:t>network</w:t>
+      </w:r>
+      <w:proofErr w:type="spellEnd"/>
+      <w:r>
+        <w:t>)</w:t>
+      </w:r>
+    </w:p>
+    <w:p>
+      <w:r>
+        <w:t xml:space="preserve">Vprašanje: Kakšna je </w:t>
+      </w:r>
+      <w:r>
+        <w:t>razlika</w:t>
+      </w:r>
+      <w:r>
+        <w:t xml:space="preserve"> med </w:t>
+      </w:r>
+      <w:proofErr w:type="spellStart"/>
+      <w:r>
+        <w:t>compute</w:t>
+      </w:r>
+      <w:proofErr w:type="spellEnd"/>
+      <w:r>
+        <w:t xml:space="preserve">, </w:t>
+      </w:r>
+      <w:proofErr w:type="spellStart"/>
+      <w:r>
+        <w:t>storage</w:t>
+      </w:r>
+      <w:proofErr w:type="spellEnd"/>
+      <w:r>
+        <w:t xml:space="preserve">, </w:t>
+      </w:r>
+      <w:proofErr w:type="spellStart"/>
+      <w:r>
+        <w:t>database</w:t>
+      </w:r>
+      <w:proofErr w:type="spellEnd"/>
+      <w:r>
+        <w:t xml:space="preserve"> </w:t>
+      </w:r>
+      <w:r>
+        <w:t>v</w:t>
+      </w:r>
+      <w:r>
+        <w:t xml:space="preserve">iri v oblaku ? </w:t>
+      </w:r>
+    </w:p>
+    <w:p>
+      <w:pPr>
+        <w:pStyle w:val="Odstavekseznama"/>
+        <w:numPr>
+          <w:ilvl w:val="0"/>
+          <w:numId w:val="9"/>
+        </w:numPr>
+      </w:pPr>
+      <w:r>
+        <w:t xml:space="preserve">stran 6-8, </w:t>
+      </w:r>
+      <w:proofErr w:type="spellStart"/>
+      <w:r>
+        <w:t>Key</w:t>
+      </w:r>
+      <w:proofErr w:type="spellEnd"/>
+      <w:r>
+        <w:t xml:space="preserve"> </w:t>
+      </w:r>
+      <w:proofErr w:type="spellStart"/>
+      <w:r>
+        <w:t>Cloud</w:t>
+      </w:r>
+      <w:proofErr w:type="spellEnd"/>
+      <w:r>
+        <w:t xml:space="preserve"> </w:t>
+      </w:r>
+      <w:proofErr w:type="spellStart"/>
+      <w:r>
+        <w:t>Concepts</w:t>
+      </w:r>
+      <w:proofErr w:type="spellEnd"/>
+      <w:r>
+        <w:t xml:space="preserve"> – </w:t>
+      </w:r>
+      <w:proofErr w:type="spellStart"/>
+      <w:r>
+        <w:t>Shared</w:t>
+      </w:r>
+      <w:proofErr w:type="spellEnd"/>
+      <w:r>
+        <w:t xml:space="preserve"> </w:t>
+      </w:r>
+      <w:proofErr w:type="spellStart"/>
+      <w:r>
+        <w:t>infrastructure</w:t>
+      </w:r>
+      <w:proofErr w:type="spellEnd"/>
+    </w:p>
+    <w:p>
+      <w:r>
+        <w:t xml:space="preserve">Vprašanje: kaj pomeni </w:t>
+      </w:r>
+      <w:proofErr w:type="spellStart"/>
+      <w:r>
+        <w:t>shared</w:t>
+      </w:r>
+      <w:proofErr w:type="spellEnd"/>
+      <w:r>
+        <w:t xml:space="preserve"> </w:t>
+      </w:r>
+      <w:proofErr w:type="spellStart"/>
+      <w:r>
+        <w:t>infrastructure</w:t>
+      </w:r>
+      <w:proofErr w:type="spellEnd"/>
+      <w:r>
+        <w:t>, in ali prinaša kakšne prednosti</w:t>
+      </w:r>
+    </w:p>
+    <w:p>
+      <w:pPr>
+        <w:pStyle w:val="Odstavekseznama"/>
+        <w:numPr>
+          <w:ilvl w:val="0"/>
+          <w:numId w:val="9"/>
+        </w:numPr>
+      </w:pPr>
+      <w:r>
+        <w:t xml:space="preserve">stran </w:t>
+      </w:r>
+      <w:r>
+        <w:t>8-9</w:t>
+      </w:r>
+      <w:r>
+        <w:t xml:space="preserve">, </w:t>
+      </w:r>
+      <w:proofErr w:type="spellStart"/>
+      <w:r>
+        <w:t>Key</w:t>
+      </w:r>
+      <w:proofErr w:type="spellEnd"/>
+      <w:r>
+        <w:t xml:space="preserve"> </w:t>
+      </w:r>
+      <w:proofErr w:type="spellStart"/>
+      <w:r>
+        <w:t>cloud</w:t>
+      </w:r>
+      <w:proofErr w:type="spellEnd"/>
+      <w:r>
+        <w:t xml:space="preserve"> </w:t>
+      </w:r>
+      <w:proofErr w:type="spellStart"/>
+      <w:r>
+        <w:t>Concepts</w:t>
+      </w:r>
+      <w:proofErr w:type="spellEnd"/>
+      <w:r>
+        <w:t xml:space="preserve"> – </w:t>
+      </w:r>
+      <w:proofErr w:type="spellStart"/>
+      <w:r>
+        <w:t>Economy</w:t>
+      </w:r>
+      <w:proofErr w:type="spellEnd"/>
+      <w:r>
+        <w:t xml:space="preserve"> </w:t>
+      </w:r>
+      <w:proofErr w:type="spellStart"/>
+      <w:r>
+        <w:t>of</w:t>
+      </w:r>
+      <w:proofErr w:type="spellEnd"/>
+      <w:r>
+        <w:t xml:space="preserve"> scale</w:t>
+      </w:r>
+    </w:p>
+    <w:p>
+      <w:r>
+        <w:t xml:space="preserve">Vprašanje: zakaj ima </w:t>
+      </w:r>
+      <w:proofErr w:type="spellStart"/>
+      <w:r>
+        <w:t>cloud</w:t>
+      </w:r>
+      <w:proofErr w:type="spellEnd"/>
+      <w:r>
+        <w:t xml:space="preserve"> nižje stroške v primerjavi z lokalnim sistemom ? </w:t>
+      </w:r>
+    </w:p>
+    <w:p>
+      <w:pPr>
+        <w:pStyle w:val="Odstavekseznama"/>
+        <w:numPr>
+          <w:ilvl w:val="0"/>
+          <w:numId w:val="9"/>
+        </w:numPr>
+      </w:pPr>
+      <w:r>
+        <w:t xml:space="preserve">stran 15, Data centre </w:t>
+      </w:r>
+      <w:proofErr w:type="spellStart"/>
+      <w:r>
+        <w:t>vs</w:t>
+      </w:r>
+      <w:proofErr w:type="spellEnd"/>
+      <w:r>
+        <w:t xml:space="preserve"> </w:t>
+      </w:r>
+      <w:proofErr w:type="spellStart"/>
+      <w:r>
+        <w:t>Cloud</w:t>
+      </w:r>
+      <w:proofErr w:type="spellEnd"/>
+    </w:p>
+    <w:p>
+      <w:r>
+        <w:t>Vprašanje: Kako se tradicionalna omrežna infrastruktura (</w:t>
+      </w:r>
+      <w:proofErr w:type="spellStart"/>
+      <w:r>
+        <w:t>routerji</w:t>
+      </w:r>
+      <w:proofErr w:type="spellEnd"/>
+      <w:r>
+        <w:t xml:space="preserve">) prenesejo v </w:t>
+      </w:r>
+      <w:proofErr w:type="spellStart"/>
+      <w:r>
+        <w:t>cloud</w:t>
+      </w:r>
+      <w:proofErr w:type="spellEnd"/>
+      <w:r>
+        <w:t xml:space="preserve"> okolje ?</w:t>
+      </w:r>
+    </w:p>
+    <w:p>
+      <w:pPr>
+        <w:rPr>
+          <w:b/>
+          <w:bCs/>
+        </w:rPr>
+      </w:pPr>
+      <w:r>
+        <w:rPr>
+          <w:b/>
+          <w:bCs/>
+        </w:rPr>
+        <w:t>b)</w:t>
+      </w:r>
+    </w:p>
+    <w:p>
+      <w:r>
+        <w:t>Na vprašanja odgovorite.</w:t>
+      </w:r>
+    </w:p>
+    <w:p>
+      <w:pPr>
+        <w:rPr>
+          <w:b/>
+          <w:bCs/>
+        </w:rPr>
+      </w:pPr>
+      <w:r>
+        <w:rPr>
+          <w:b/>
+          <w:bCs/>
+        </w:rPr>
+        <w:t>Vprašanja</w:t>
+      </w:r>
+    </w:p>
+    <w:p>
+      <w:pPr>
+        <w:rPr>
+          <w:b/>
+          <w:bCs/>
+        </w:rPr>
+      </w:pPr>
+      <w:r>
+        <w:rPr>
+          <w:b/>
+          <w:bCs/>
+        </w:rPr>
+        <w:t>i.</w:t>
+      </w:r>
+    </w:p>
+    <w:p>
+      <w:r>
+        <w:t xml:space="preserve">Kateri </w:t>
+      </w:r>
+      <w:r>
+        <w:rPr>
+          <w:b/>
+          <w:bCs/>
+        </w:rPr>
+        <w:t>model oblačne storitve (</w:t>
+      </w:r>
+      <w:proofErr w:type="spellStart"/>
+      <w:r>
+        <w:rPr>
+          <w:b/>
+          <w:bCs/>
+        </w:rPr>
+        <w:t>Cloud</w:t>
+      </w:r>
+      <w:proofErr w:type="spellEnd"/>
+      <w:r>
+        <w:rPr>
+          <w:b/>
+          <w:bCs/>
+        </w:rPr>
+        <w:t xml:space="preserve"> </w:t>
+      </w:r>
+      <w:proofErr w:type="spellStart"/>
+      <w:r>
+        <w:rPr>
+          <w:b/>
+          <w:bCs/>
+        </w:rPr>
+        <w:t>Service</w:t>
+      </w:r>
+      <w:proofErr w:type="spellEnd"/>
+      <w:r>
+        <w:rPr>
+          <w:b/>
+          <w:bCs/>
+        </w:rPr>
+        <w:t xml:space="preserve"> Model)</w:t>
+      </w:r>
+      <w:r>
+        <w:t xml:space="preserve"> uporabljata naslednji storitvi?</w:t>
+      </w:r>
+    </w:p>
+    <w:p>
+      <w:pPr>
+        <w:numPr>
+          <w:ilvl w:val="0"/>
+          <w:numId w:val="2"/>
+        </w:numPr>
+      </w:pPr>
+      <w:r>
+        <w:t>EC2</w:t>
+      </w:r>
+      <w:r>
+        <w:t xml:space="preserve"> </w:t>
+      </w:r>
+      <w:r>
+        <w:rPr>
+          <w:color w:val="00B050"/>
+        </w:rPr>
+        <w:t xml:space="preserve">spada pod mode  </w:t>
+      </w:r>
+      <w:proofErr w:type="spellStart"/>
+      <w:r>
+        <w:rPr>
+          <w:color w:val="00B050"/>
+        </w:rPr>
+        <w:t>IaaS</w:t>
+      </w:r>
+      <w:proofErr w:type="spellEnd"/>
+      <w:r>
+        <w:rPr>
+          <w:color w:val="00B050"/>
+        </w:rPr>
+        <w:t xml:space="preserve"> (</w:t>
+      </w:r>
+      <w:proofErr w:type="spellStart"/>
+      <w:r>
+        <w:rPr>
+          <w:color w:val="00B050"/>
+        </w:rPr>
+        <w:t>Infrastructure</w:t>
+      </w:r>
+      <w:proofErr w:type="spellEnd"/>
+      <w:r>
+        <w:rPr>
+          <w:color w:val="00B050"/>
+        </w:rPr>
+        <w:t xml:space="preserve"> as a </w:t>
+      </w:r>
+      <w:proofErr w:type="spellStart"/>
+      <w:r>
+        <w:rPr>
+          <w:color w:val="00B050"/>
+        </w:rPr>
+        <w:t>Service</w:t>
+      </w:r>
+      <w:proofErr w:type="spellEnd"/>
+      <w:r>
+        <w:rPr>
+          <w:color w:val="00B050"/>
+        </w:rPr>
+        <w:t xml:space="preserve">), ker s tem ustvarimo virtualni računalnik, pri katerem potem že sami izbiramo operacijski sistem in imamo veliko nadzora nad sistemom </w:t>
+      </w:r>
+    </w:p>
+    <w:p>
+      <w:pPr>
+        <w:numPr>
+          <w:ilvl w:val="0"/>
+          <w:numId w:val="2"/>
+        </w:numPr>
+      </w:pPr>
+      <w:proofErr w:type="spellStart"/>
+      <w:r>
+        <w:t>GitHub</w:t>
+      </w:r>
+      <w:proofErr w:type="spellEnd"/>
+      <w:r>
+        <w:t xml:space="preserve"> </w:t>
+      </w:r>
+      <w:r>
+        <w:rPr>
+          <w:color w:val="00B050"/>
+        </w:rPr>
+        <w:t xml:space="preserve">je pa model </w:t>
+      </w:r>
+      <w:proofErr w:type="spellStart"/>
+      <w:r>
+        <w:rPr>
+          <w:color w:val="00B050"/>
+        </w:rPr>
+        <w:t>SaaS</w:t>
+      </w:r>
+      <w:proofErr w:type="spellEnd"/>
+      <w:r>
+        <w:rPr>
+          <w:color w:val="00B050"/>
+        </w:rPr>
+        <w:t xml:space="preserve"> (Software as </w:t>
+      </w:r>
+      <w:proofErr w:type="spellStart"/>
+      <w:r>
+        <w:rPr>
+          <w:color w:val="00B050"/>
+        </w:rPr>
+        <w:t>service</w:t>
+      </w:r>
+      <w:proofErr w:type="spellEnd"/>
+      <w:r>
+        <w:rPr>
+          <w:color w:val="00B050"/>
+        </w:rPr>
+        <w:t xml:space="preserve">). </w:t>
+      </w:r>
+      <w:proofErr w:type="spellStart"/>
+      <w:r>
+        <w:rPr>
+          <w:color w:val="00B050"/>
+        </w:rPr>
+        <w:t>Git</w:t>
+      </w:r>
+      <w:proofErr w:type="spellEnd"/>
+      <w:r>
+        <w:rPr>
+          <w:color w:val="00B050"/>
+        </w:rPr>
+        <w:t xml:space="preserve"> hub je že kompletna aplikacija, ki je dostopna preko interneta in ni potrebno nič nameščati.</w:t>
+      </w:r>
+    </w:p>
+    <w:p>
+      <w:r>
+        <w:t>Razložite svoj odgovor.</w:t>
+      </w:r>
+    </w:p>
+    <w:p>
+      <w:r>
+        <w:t xml:space="preserve">Kaj pa </w:t>
+      </w:r>
+      <w:r>
+        <w:rPr>
+          <w:b/>
+          <w:bCs/>
+        </w:rPr>
+        <w:t>virtualni računalnik</w:t>
+      </w:r>
+      <w:r>
+        <w:t>, ki smo ga namestili na prvem srečanju?</w:t>
+      </w:r>
+    </w:p>
+    <w:p>
+      <w:pPr>
+        <w:numPr>
+          <w:ilvl w:val="0"/>
+          <w:numId w:val="3"/>
+        </w:numPr>
+      </w:pPr>
+      <w:r>
+        <w:t xml:space="preserve">Ali ga lahko štejemo za </w:t>
+      </w:r>
+      <w:r>
+        <w:rPr>
+          <w:b/>
+          <w:bCs/>
+        </w:rPr>
+        <w:t>oblačno storitev</w:t>
+      </w:r>
+      <w:r>
+        <w:t>?</w:t>
+      </w:r>
+    </w:p>
+    <w:p>
+      <w:pPr>
+        <w:rPr>
+          <w:color w:val="00B050"/>
+        </w:rPr>
+      </w:pPr>
+      <w:r>
+        <w:rPr>
+          <w:color w:val="00B050"/>
+        </w:rPr>
+        <w:t>Virtualni računalnik, ki ga ustvarimo na našem lokalnem računalniku ni oblačna storitev.</w:t>
+      </w:r>
+    </w:p>
+    <w:p>
+      <w:pPr>
+        <w:numPr>
+          <w:ilvl w:val="0"/>
+          <w:numId w:val="3"/>
+        </w:numPr>
+      </w:pPr>
+      <w:r>
+        <w:t>Če ne, zakaj ne?</w:t>
+      </w:r>
+    </w:p>
+    <w:p>
+      <w:pPr>
+        <w:rPr>
+          <w:color w:val="00B050"/>
+        </w:rPr>
+      </w:pPr>
+      <w:r>
+        <w:rPr>
+          <w:color w:val="00B050"/>
+        </w:rPr>
+        <w:t>Tak virtualni računalnik deluje lokalno in ni dostopen preko interneta.</w:t>
+      </w:r>
+    </w:p>
+    <w:p>
+      <w:r>
+        <w:pict w14:anchorId="7E11BB7B">
+          <v:rect id="_x0000_i1050" style="width:470.3pt;height:1.2pt" o:hralign="center" o:hrstd="t" o:hr="t" fillcolor="#a0a0a0" stroked="f"/>
+        </w:pict>
+      </w:r>
+    </w:p>
+    <w:p>
+      <w:pPr>
+        <w:rPr>
+          <w:b/>
+          <w:bCs/>
+        </w:rPr>
+      </w:pPr>
+      <w:r>
+        <w:rPr>
+          <w:b/>
+          <w:bCs/>
+        </w:rPr>
+        <w:t>ii.</w:t>
+      </w:r>
+    </w:p>
+    <w:p>
+      <w:r>
+        <w:t xml:space="preserve">Dokument omenja različne </w:t>
+      </w:r>
+      <w:r>
+        <w:rPr>
+          <w:b/>
+          <w:bCs/>
+        </w:rPr>
+        <w:t>vire (</w:t>
+      </w:r>
+      <w:proofErr w:type="spellStart"/>
+      <w:r>
+        <w:rPr>
+          <w:b/>
+          <w:bCs/>
+        </w:rPr>
+        <w:t>resources</w:t>
+      </w:r>
+      <w:proofErr w:type="spellEnd"/>
+      <w:r>
+        <w:rPr>
+          <w:b/>
+          <w:bCs/>
+        </w:rPr>
+        <w:t>)</w:t>
+      </w:r>
+      <w:r>
+        <w:t>, ki jih uporabljajo oblačne storitve.</w:t>
+      </w:r>
+    </w:p>
+    <w:p>
+      <w:r>
+        <w:lastRenderedPageBreak/>
+        <w:t xml:space="preserve">Za storitvi </w:t>
+      </w:r>
+      <w:r>
+        <w:rPr>
+          <w:b/>
+          <w:bCs/>
+        </w:rPr>
+        <w:t>EC2</w:t>
+      </w:r>
+      <w:r>
+        <w:t xml:space="preserve"> in </w:t>
+      </w:r>
+      <w:proofErr w:type="spellStart"/>
+      <w:r>
+        <w:rPr>
+          <w:b/>
+          <w:bCs/>
+        </w:rPr>
+        <w:t>GitHub</w:t>
+      </w:r>
+      <w:proofErr w:type="spellEnd"/>
+      <w:r>
+        <w:t xml:space="preserve"> določite, v katero kategorijo virov sodita, na primer:</w:t>
+      </w:r>
+    </w:p>
+    <w:p>
+      <w:pPr>
+        <w:numPr>
+          <w:ilvl w:val="0"/>
+          <w:numId w:val="4"/>
+        </w:numPr>
+      </w:pPr>
+      <w:proofErr w:type="spellStart"/>
+      <w:r>
+        <w:t>compute</w:t>
+      </w:r>
+      <w:proofErr w:type="spellEnd"/>
+    </w:p>
+    <w:p>
+      <w:pPr>
+        <w:numPr>
+          <w:ilvl w:val="0"/>
+          <w:numId w:val="4"/>
+        </w:numPr>
+      </w:pPr>
+      <w:proofErr w:type="spellStart"/>
+      <w:r>
+        <w:t>storage</w:t>
+      </w:r>
+      <w:proofErr w:type="spellEnd"/>
+    </w:p>
+    <w:p>
+      <w:pPr>
+        <w:numPr>
+          <w:ilvl w:val="0"/>
+          <w:numId w:val="4"/>
+        </w:numPr>
+      </w:pPr>
+      <w:proofErr w:type="spellStart"/>
+      <w:r>
+        <w:t>database</w:t>
+      </w:r>
+      <w:proofErr w:type="spellEnd"/>
+    </w:p>
+    <w:p>
+      <w:pPr>
+        <w:numPr>
+          <w:ilvl w:val="0"/>
+          <w:numId w:val="4"/>
+        </w:numPr>
+      </w:pPr>
+      <w:proofErr w:type="spellStart"/>
+      <w:r>
+        <w:t>network</w:t>
+      </w:r>
+      <w:proofErr w:type="spellEnd"/>
+    </w:p>
+    <w:p>
+      <w:pPr>
+        <w:numPr>
+          <w:ilvl w:val="0"/>
+          <w:numId w:val="4"/>
+        </w:numPr>
+      </w:pPr>
+      <w:proofErr w:type="spellStart"/>
+      <w:r>
+        <w:t>artificial</w:t>
+      </w:r>
+      <w:proofErr w:type="spellEnd"/>
+      <w:r>
+        <w:t xml:space="preserve"> </w:t>
+      </w:r>
+      <w:proofErr w:type="spellStart"/>
+      <w:r>
+        <w:t>intelligence</w:t>
+      </w:r>
+      <w:proofErr w:type="spellEnd"/>
+    </w:p>
+    <w:p>
+      <w:pPr>
+        <w:numPr>
+          <w:ilvl w:val="0"/>
+          <w:numId w:val="4"/>
+        </w:numPr>
+      </w:pPr>
+      <w:proofErr w:type="spellStart"/>
+      <w:r>
+        <w:t>machine</w:t>
+      </w:r>
+      <w:proofErr w:type="spellEnd"/>
+      <w:r>
+        <w:t xml:space="preserve"> </w:t>
+      </w:r>
+      <w:proofErr w:type="spellStart"/>
+      <w:r>
+        <w:t>learning</w:t>
+      </w:r>
+      <w:proofErr w:type="spellEnd"/>
+    </w:p>
+    <w:p>
+      <w:r>
+        <w:t>Utemeljite svoj odgovor.</w:t>
+      </w:r>
+    </w:p>
+    <w:p>
+      <w:pPr>
+        <w:rPr>
+          <w:color w:val="00B050"/>
+        </w:rPr>
+      </w:pPr>
+      <w:r>
+        <w:rPr>
+          <w:color w:val="00B050"/>
+        </w:rPr>
+        <w:t xml:space="preserve">EC 2 spada pod vire </w:t>
+      </w:r>
+      <w:proofErr w:type="spellStart"/>
+      <w:r>
+        <w:rPr>
+          <w:color w:val="00B050"/>
+        </w:rPr>
+        <w:t>compute</w:t>
+      </w:r>
+      <w:proofErr w:type="spellEnd"/>
+      <w:r>
+        <w:rPr>
+          <w:color w:val="00B050"/>
+        </w:rPr>
+        <w:t xml:space="preserve">. Zagotavlja nam procesorsko moč (CPU, RAM), kar pa spada pod </w:t>
+      </w:r>
+      <w:proofErr w:type="spellStart"/>
+      <w:r>
+        <w:rPr>
+          <w:color w:val="00B050"/>
+        </w:rPr>
+        <w:t>compute</w:t>
+      </w:r>
+      <w:proofErr w:type="spellEnd"/>
+      <w:r>
+        <w:rPr>
+          <w:color w:val="00B050"/>
+        </w:rPr>
+        <w:t xml:space="preserve"> vire.</w:t>
+      </w:r>
+    </w:p>
+    <w:p>
+      <w:pPr>
+        <w:rPr>
+          <w:color w:val="00B050"/>
+        </w:rPr>
+      </w:pPr>
+      <w:proofErr w:type="spellStart"/>
+      <w:r>
+        <w:rPr>
+          <w:color w:val="00B050"/>
+        </w:rPr>
+        <w:t>GitHub</w:t>
+      </w:r>
+      <w:proofErr w:type="spellEnd"/>
+      <w:r>
+        <w:rPr>
+          <w:color w:val="00B050"/>
+        </w:rPr>
+        <w:t xml:space="preserve"> lahko damo med </w:t>
+      </w:r>
+      <w:proofErr w:type="spellStart"/>
+      <w:r>
+        <w:rPr>
+          <w:color w:val="00B050"/>
+        </w:rPr>
+        <w:t>storage</w:t>
+      </w:r>
+      <w:proofErr w:type="spellEnd"/>
+      <w:r>
+        <w:rPr>
+          <w:color w:val="00B050"/>
+        </w:rPr>
+        <w:t xml:space="preserve"> vire, ker shranjuje kodo in omogoča tudi njeno obdelavo</w:t>
+      </w:r>
+    </w:p>
+    <w:p>
+      <w:r>
+        <w:pict w14:anchorId="0952532D">
+          <v:rect id="_x0000_i1051" style="width:470.3pt;height:1.2pt" o:hralign="center" o:hrstd="t" o:hr="t" fillcolor="#a0a0a0" stroked="f"/>
+        </w:pict>
+      </w:r>
+    </w:p>
+    <w:p>
+      <w:pPr>
+        <w:rPr>
+          <w:b/>
+          <w:bCs/>
+        </w:rPr>
+      </w:pPr>
+      <w:r>
+        <w:rPr>
+          <w:b/>
+          <w:bCs/>
+        </w:rPr>
+        <w:t>iii.</w:t>
+      </w:r>
+    </w:p>
+    <w:p>
+      <w:r>
+        <w:t xml:space="preserve">Storitvi </w:t>
+      </w:r>
+      <w:r>
+        <w:rPr>
+          <w:b/>
+          <w:bCs/>
+        </w:rPr>
+        <w:t>EC2</w:t>
+      </w:r>
+      <w:r>
+        <w:t xml:space="preserve"> in </w:t>
+      </w:r>
+      <w:proofErr w:type="spellStart"/>
+      <w:r>
+        <w:rPr>
+          <w:b/>
+          <w:bCs/>
+        </w:rPr>
+        <w:t>GitHub</w:t>
+      </w:r>
+      <w:proofErr w:type="spellEnd"/>
+      <w:r>
+        <w:t xml:space="preserve"> uvrstite med </w:t>
+      </w:r>
+      <w:r>
+        <w:rPr>
+          <w:b/>
+          <w:bCs/>
+        </w:rPr>
+        <w:t>modele oblačnih storitev (</w:t>
+      </w:r>
+      <w:proofErr w:type="spellStart"/>
+      <w:r>
+        <w:rPr>
+          <w:b/>
+          <w:bCs/>
+        </w:rPr>
+        <w:t>Cloud</w:t>
+      </w:r>
+      <w:proofErr w:type="spellEnd"/>
+      <w:r>
+        <w:rPr>
+          <w:b/>
+          <w:bCs/>
+        </w:rPr>
+        <w:t xml:space="preserve"> </w:t>
+      </w:r>
+      <w:proofErr w:type="spellStart"/>
+      <w:r>
+        <w:rPr>
+          <w:b/>
+          <w:bCs/>
+        </w:rPr>
+        <w:t>Service</w:t>
+      </w:r>
+      <w:proofErr w:type="spellEnd"/>
+      <w:r>
+        <w:rPr>
+          <w:b/>
+          <w:bCs/>
+        </w:rPr>
+        <w:t xml:space="preserve"> </w:t>
+      </w:r>
+      <w:proofErr w:type="spellStart"/>
+      <w:r>
+        <w:rPr>
+          <w:b/>
+          <w:bCs/>
+        </w:rPr>
+        <w:t>Models</w:t>
+      </w:r>
+      <w:proofErr w:type="spellEnd"/>
+      <w:r>
+        <w:rPr>
+          <w:b/>
+          <w:bCs/>
+        </w:rPr>
+        <w:t>)</w:t>
+      </w:r>
+      <w:r>
+        <w:t>:</w:t>
+      </w:r>
+    </w:p>
+    <w:p>
+      <w:pPr>
+        <w:numPr>
+          <w:ilvl w:val="0"/>
+          <w:numId w:val="5"/>
+        </w:numPr>
+      </w:pPr>
+      <w:proofErr w:type="spellStart"/>
+      <w:r>
+        <w:t>IaaS</w:t>
+      </w:r>
+      <w:proofErr w:type="spellEnd"/>
+    </w:p>
+    <w:p>
+      <w:pPr>
+        <w:numPr>
+          <w:ilvl w:val="0"/>
+          <w:numId w:val="5"/>
+        </w:numPr>
+      </w:pPr>
+      <w:proofErr w:type="spellStart"/>
+      <w:r>
+        <w:t>PaaS</w:t>
+      </w:r>
+      <w:proofErr w:type="spellEnd"/>
+    </w:p>
+    <w:p>
+      <w:pPr>
+        <w:numPr>
+          <w:ilvl w:val="0"/>
+          <w:numId w:val="5"/>
+        </w:numPr>
+      </w:pPr>
+      <w:proofErr w:type="spellStart"/>
+      <w:r>
+        <w:t>SaaS</w:t>
+      </w:r>
+      <w:proofErr w:type="spellEnd"/>
+    </w:p>
+    <w:p>
+      <w:r>
+        <w:t>Razložite, zakaj ste se tako odločili.</w:t>
+      </w:r>
+    </w:p>
+    <w:p>
+      <w:pPr>
+        <w:rPr>
+          <w:color w:val="00B050"/>
+        </w:rPr>
+      </w:pPr>
+      <w:r>
+        <w:rPr>
+          <w:color w:val="00B050"/>
+        </w:rPr>
+        <w:t xml:space="preserve">EC 2 bi </w:t>
+      </w:r>
+      <w:proofErr w:type="spellStart"/>
+      <w:r>
+        <w:rPr>
+          <w:color w:val="00B050"/>
+        </w:rPr>
+        <w:t>uvstril</w:t>
+      </w:r>
+      <w:proofErr w:type="spellEnd"/>
+      <w:r>
+        <w:rPr>
+          <w:color w:val="00B050"/>
+        </w:rPr>
+        <w:t xml:space="preserve"> v model </w:t>
+      </w:r>
+      <w:proofErr w:type="spellStart"/>
+      <w:r>
+        <w:rPr>
+          <w:color w:val="00B050"/>
+        </w:rPr>
+        <w:t>IaaS</w:t>
+      </w:r>
+      <w:proofErr w:type="spellEnd"/>
+      <w:r>
+        <w:rPr>
+          <w:color w:val="00B050"/>
+        </w:rPr>
+        <w:t xml:space="preserve">. Pri tem modelu imamo največ nadzora, sami odločamo o operacijskem sistemu in aplikacijah. Prav tako je najbolj </w:t>
+      </w:r>
+      <w:proofErr w:type="spellStart"/>
+      <w:r>
+        <w:rPr>
+          <w:color w:val="00B050"/>
+        </w:rPr>
+        <w:t>prilagoljiv</w:t>
+      </w:r>
+      <w:proofErr w:type="spellEnd"/>
+    </w:p>
+    <w:p>
+      <w:pPr>
+        <w:rPr>
+          <w:color w:val="00B050"/>
+        </w:rPr>
+      </w:pPr>
+      <w:proofErr w:type="spellStart"/>
+      <w:r>
+        <w:rPr>
+          <w:color w:val="00B050"/>
+        </w:rPr>
+        <w:t>Github</w:t>
+      </w:r>
+      <w:proofErr w:type="spellEnd"/>
+      <w:r>
+        <w:rPr>
+          <w:color w:val="00B050"/>
+        </w:rPr>
+        <w:t xml:space="preserve"> je pa model </w:t>
+      </w:r>
+      <w:proofErr w:type="spellStart"/>
+      <w:r>
+        <w:rPr>
+          <w:color w:val="00B050"/>
+        </w:rPr>
+        <w:t>SaaS</w:t>
+      </w:r>
+      <w:proofErr w:type="spellEnd"/>
+      <w:r>
+        <w:rPr>
+          <w:color w:val="00B050"/>
+        </w:rPr>
+        <w:t>, saj ga uporabljamo kot aplikacijo kar preko interneta. Ni nam potrebno nič nameščati in celotno upravljanje prevzame ponudnik</w:t>
+      </w:r>
+    </w:p>
+    <w:p>
+      <w:r>
+        <w:pict w14:anchorId="364D91A2">
+          <v:rect id="_x0000_i1052" style="width:470.3pt;height:1.2pt" o:hralign="center" o:hrstd="t" o:hr="t" fillcolor="#a0a0a0" stroked="f"/>
+        </w:pict>
+      </w:r>
+    </w:p>
+    <w:p>
+      <w:pPr>
+        <w:rPr>
+          <w:b/>
+          <w:bCs/>
+        </w:rPr>
+      </w:pPr>
+      <w:r>
+        <w:rPr>
+          <w:b/>
+          <w:bCs/>
+        </w:rPr>
+        <w:t>iv.</w:t>
+      </w:r>
+    </w:p>
+    <w:p>
+      <w:r>
+        <w:t xml:space="preserve">Za katere </w:t>
+      </w:r>
+      <w:r>
+        <w:rPr>
+          <w:b/>
+          <w:bCs/>
+        </w:rPr>
+        <w:t>primere uporabe (</w:t>
+      </w:r>
+      <w:proofErr w:type="spellStart"/>
+      <w:r>
+        <w:rPr>
+          <w:b/>
+          <w:bCs/>
+        </w:rPr>
+        <w:t>use</w:t>
+      </w:r>
+      <w:proofErr w:type="spellEnd"/>
+      <w:r>
+        <w:rPr>
+          <w:b/>
+          <w:bCs/>
+        </w:rPr>
+        <w:t xml:space="preserve"> </w:t>
+      </w:r>
+      <w:proofErr w:type="spellStart"/>
+      <w:r>
+        <w:rPr>
+          <w:b/>
+          <w:bCs/>
+        </w:rPr>
+        <w:t>cases</w:t>
+      </w:r>
+      <w:proofErr w:type="spellEnd"/>
+      <w:r>
+        <w:rPr>
+          <w:b/>
+          <w:bCs/>
+        </w:rPr>
+        <w:t>)</w:t>
+      </w:r>
+      <w:r>
+        <w:t xml:space="preserve"> bi lahko uporabili storitvi:</w:t>
+      </w:r>
+    </w:p>
+    <w:p>
+      <w:pPr>
+        <w:numPr>
+          <w:ilvl w:val="0"/>
+          <w:numId w:val="6"/>
+        </w:numPr>
+      </w:pPr>
+      <w:r>
+        <w:t>EC2</w:t>
+      </w:r>
+      <w:r>
+        <w:t xml:space="preserve"> </w:t>
+      </w:r>
+      <w:r>
+        <w:rPr>
+          <w:color w:val="00B050"/>
+        </w:rPr>
+        <w:t>bi lahko uporabili v namen gostovanja spletne strani, tako kot smo to delali že med srečanji. V primeru razvoja aplikacij je pa lahko uporabljeno kot testno okolje.</w:t>
+      </w:r>
+    </w:p>
+    <w:p>
+      <w:pPr>
+        <w:numPr>
+          <w:ilvl w:val="0"/>
+          <w:numId w:val="6"/>
+        </w:numPr>
+      </w:pPr>
+      <w:proofErr w:type="spellStart"/>
+      <w:r>
+        <w:t>GitHub</w:t>
+      </w:r>
+      <w:proofErr w:type="spellEnd"/>
+      <w:r>
+        <w:t xml:space="preserve"> </w:t>
+      </w:r>
+      <w:r>
+        <w:rPr>
+          <w:color w:val="00B050"/>
+        </w:rPr>
+        <w:t xml:space="preserve">uporabljajo razvijalci, da shranjujejo različne verzije kode. Omogoča </w:t>
+      </w:r>
+      <w:r>
+        <w:rPr>
+          <w:color w:val="00B050"/>
+        </w:rPr>
+        <w:t xml:space="preserve">pa </w:t>
+      </w:r>
+      <w:r>
+        <w:rPr>
+          <w:color w:val="00B050"/>
+        </w:rPr>
+        <w:t>tudi sodelovanje med</w:t>
+      </w:r>
+      <w:r>
+        <w:rPr>
+          <w:color w:val="00B050"/>
+        </w:rPr>
+        <w:t xml:space="preserve"> več</w:t>
+      </w:r>
+      <w:r>
+        <w:rPr>
+          <w:color w:val="00B050"/>
+        </w:rPr>
+        <w:t xml:space="preserve"> razvijalci, </w:t>
+      </w:r>
+      <w:r>
+        <w:rPr>
+          <w:color w:val="00B050"/>
+        </w:rPr>
+        <w:t xml:space="preserve">saj lahko več razvijalcev hkrati dela na istem projektu in si tako s pomočjo </w:t>
+      </w:r>
+      <w:proofErr w:type="spellStart"/>
+      <w:r>
+        <w:rPr>
+          <w:color w:val="00B050"/>
+        </w:rPr>
+        <w:t>githuba</w:t>
+      </w:r>
+      <w:proofErr w:type="spellEnd"/>
+      <w:r>
+        <w:rPr>
+          <w:color w:val="00B050"/>
+        </w:rPr>
+        <w:t xml:space="preserve"> delijo kodo.</w:t>
+      </w:r>
+    </w:p>
+    <w:p>
+      <w:r>
+        <w:t xml:space="preserve">Navedite vsaj </w:t>
+      </w:r>
+      <w:r>
+        <w:rPr>
+          <w:b/>
+          <w:bCs/>
+        </w:rPr>
+        <w:t>dva primera za vsako storitev</w:t>
+      </w:r>
+      <w:r>
+        <w:t>.</w:t>
+      </w:r>
+    </w:p>
+    <w:p/>
+    <w:p/>
     <w:p/>
     <w:sectPr>
       <w:pgSz w:w="11906" w:h="16838"/>
@@ -90,6 +1736,1257 @@
     </w:sectPr>
   </w:body>
 </w:document>
+</file>
+
+<file path=word/numbering.xml><?xml version="1.0" encoding="utf-8"?>
+<w:numbering xmlns:wpc="http://schemas.microsoft.com/office/word/2010/wordprocessingCanvas" xmlns:cx="http://schemas.microsoft.com/office/drawing/2014/chartex" xmlns:cx1="http://schemas.microsoft.com/office/drawing/2015/9/8/chartex" xmlns:cx2="http://schemas.microsoft.com/office/drawing/2015/10/21/chartex" xmlns:cx3="http://schemas.microsoft.com/office/drawing/2016/5/9/chartex" xmlns:cx4="http://schemas.microsoft.com/office/drawing/2016/5/10/chartex" xmlns:cx5="http://schemas.microsoft.com/office/drawing/2016/5/11/chartex" xmlns:cx6="http://schemas.microsoft.com/office/drawing/2016/5/12/chartex" xmlns:cx7="http://schemas.microsoft.com/office/drawing/2016/5/13/chartex" xmlns:cx8="http://schemas.microsoft.com/office/drawing/2016/5/14/chartex" xmlns:mc="http://schemas.openxmlformats.org/markup-compatibility/2006" xmlns:aink="http://schemas.microsoft.com/office/drawing/2016/ink" xmlns:am3d="http://schemas.microsoft.com/office/drawing/2017/model3d" xmlns:o="urn:schemas-microsoft-com:office:office" xmlns:oel="http://schemas.microsoft.com/office/2019/extlst" xmlns:r="http://schemas.openxmlformats.org/officeDocument/2006/relationships" xmlns:m="http://schemas.openxmlformats.org/officeDocument/2006/math" xmlns:v="urn:schemas-microsoft-com:vml" xmlns:wp14="http://schemas.microsoft.com/office/word/2010/wordprocessingDrawing" xmlns:wp="http://schemas.openxmlformats.org/drawingml/2006/wordprocessingDrawing" xmlns:w10="urn:schemas-microsoft-com:office:word" xmlns:w="http://schemas.openxmlformats.org/wordprocessingml/2006/main" xmlns:w14="http://schemas.microsoft.com/office/word/2010/wordml" xmlns:w15="http://schemas.microsoft.com/office/word/2012/wordml" xmlns:w16cex="http://schemas.microsoft.com/office/word/2018/wordml/cex" xmlns:w16cid="http://schemas.microsoft.com/office/word/2016/wordml/cid" xmlns:w16="http://schemas.microsoft.com/office/word/2018/wordml" xmlns:w16du="http://schemas.microsoft.com/office/word/2023/wordml/word16du" xmlns:w16sdtdh="http://schemas.microsoft.com/office/word/2020/wordml/sdtdatahash" xmlns:w16sdtfl="http://schemas.microsoft.com/office/word/2024/wordml/sdtformatlock" xmlns:w16se="http://schemas.microsoft.com/office/word/2015/wordml/symex" xmlns:wpg="http://schemas.microsoft.com/office/word/2010/wordprocessingGroup" xmlns:wpi="http://schemas.microsoft.com/office/word/2010/wordprocessingInk" xmlns:wne="http://schemas.microsoft.com/office/word/2006/wordml" xmlns:wps="http://schemas.microsoft.com/office/word/2010/wordprocessingShape" mc:Ignorable="w14 w15 w16se w16cid w16 w16cex w16sdtdh w16sdtfl w16du wp14">
+  <w:abstractNum w:abstractNumId="0" w15:restartNumberingAfterBreak="0">
+    <w:nsid w:val="16434BB0"/>
+    <w:multiLevelType w:val="multilevel"/>
+    <w:tmpl w:val="B29CA746"/>
+    <w:lvl w:ilvl="0">
+      <w:start w:val="1"/>
+      <w:numFmt w:val="bullet"/>
+      <w:lvlText w:val=""/>
+      <w:lvlJc w:val="left"/>
+      <w:pPr>
+        <w:tabs>
+          <w:tab w:val="num" w:pos="720"/>
+        </w:tabs>
+        <w:ind w:left="720" w:hanging="360"/>
+      </w:pPr>
+      <w:rPr>
+        <w:rFonts w:ascii="Symbol" w:hAnsi="Symbol" w:hint="default"/>
+        <w:sz w:val="20"/>
+      </w:rPr>
+    </w:lvl>
+    <w:lvl w:ilvl="1">
+      <w:start w:val="1"/>
+      <w:numFmt w:val="bullet"/>
+      <w:lvlText w:val="o"/>
+      <w:lvlJc w:val="left"/>
+      <w:pPr>
+        <w:tabs>
+          <w:tab w:val="num" w:pos="1440"/>
+        </w:tabs>
+        <w:ind w:left="1440" w:hanging="360"/>
+      </w:pPr>
+      <w:rPr>
+        <w:rFonts w:ascii="Courier New" w:hAnsi="Courier New" w:cs="Times New Roman" w:hint="default"/>
+        <w:sz w:val="20"/>
+      </w:rPr>
+    </w:lvl>
+    <w:lvl w:ilvl="2">
+      <w:start w:val="1"/>
+      <w:numFmt w:val="bullet"/>
+      <w:lvlText w:val=""/>
+      <w:lvlJc w:val="left"/>
+      <w:pPr>
+        <w:tabs>
+          <w:tab w:val="num" w:pos="2160"/>
+        </w:tabs>
+        <w:ind w:left="2160" w:hanging="360"/>
+      </w:pPr>
+      <w:rPr>
+        <w:rFonts w:ascii="Wingdings" w:hAnsi="Wingdings" w:hint="default"/>
+        <w:sz w:val="20"/>
+      </w:rPr>
+    </w:lvl>
+    <w:lvl w:ilvl="3">
+      <w:start w:val="1"/>
+      <w:numFmt w:val="bullet"/>
+      <w:lvlText w:val=""/>
+      <w:lvlJc w:val="left"/>
+      <w:pPr>
+        <w:tabs>
+          <w:tab w:val="num" w:pos="2880"/>
+        </w:tabs>
+        <w:ind w:left="2880" w:hanging="360"/>
+      </w:pPr>
+      <w:rPr>
+        <w:rFonts w:ascii="Wingdings" w:hAnsi="Wingdings" w:hint="default"/>
+        <w:sz w:val="20"/>
+      </w:rPr>
+    </w:lvl>
+    <w:lvl w:ilvl="4">
+      <w:start w:val="1"/>
+      <w:numFmt w:val="bullet"/>
+      <w:lvlText w:val=""/>
+      <w:lvlJc w:val="left"/>
+      <w:pPr>
+        <w:tabs>
+          <w:tab w:val="num" w:pos="3600"/>
+        </w:tabs>
+        <w:ind w:left="3600" w:hanging="360"/>
+      </w:pPr>
+      <w:rPr>
+        <w:rFonts w:ascii="Wingdings" w:hAnsi="Wingdings" w:hint="default"/>
+        <w:sz w:val="20"/>
+      </w:rPr>
+    </w:lvl>
+    <w:lvl w:ilvl="5">
+      <w:start w:val="1"/>
+      <w:numFmt w:val="bullet"/>
+      <w:lvlText w:val=""/>
+      <w:lvlJc w:val="left"/>
+      <w:pPr>
+        <w:tabs>
+          <w:tab w:val="num" w:pos="4320"/>
+        </w:tabs>
+        <w:ind w:left="4320" w:hanging="360"/>
+      </w:pPr>
+      <w:rPr>
+        <w:rFonts w:ascii="Wingdings" w:hAnsi="Wingdings" w:hint="default"/>
+        <w:sz w:val="20"/>
+      </w:rPr>
+    </w:lvl>
+    <w:lvl w:ilvl="6">
+      <w:start w:val="1"/>
+      <w:numFmt w:val="bullet"/>
+      <w:lvlText w:val=""/>
+      <w:lvlJc w:val="left"/>
+      <w:pPr>
+        <w:tabs>
+          <w:tab w:val="num" w:pos="5040"/>
+        </w:tabs>
+        <w:ind w:left="5040" w:hanging="360"/>
+      </w:pPr>
+      <w:rPr>
+        <w:rFonts w:ascii="Wingdings" w:hAnsi="Wingdings" w:hint="default"/>
+        <w:sz w:val="20"/>
+      </w:rPr>
+    </w:lvl>
+    <w:lvl w:ilvl="7">
+      <w:start w:val="1"/>
+      <w:numFmt w:val="bullet"/>
+      <w:lvlText w:val=""/>
+      <w:lvlJc w:val="left"/>
+      <w:pPr>
+        <w:tabs>
+          <w:tab w:val="num" w:pos="5760"/>
+        </w:tabs>
+        <w:ind w:left="5760" w:hanging="360"/>
+      </w:pPr>
+      <w:rPr>
+        <w:rFonts w:ascii="Wingdings" w:hAnsi="Wingdings" w:hint="default"/>
+        <w:sz w:val="20"/>
+      </w:rPr>
+    </w:lvl>
+    <w:lvl w:ilvl="8">
+      <w:start w:val="1"/>
+      <w:numFmt w:val="bullet"/>
+      <w:lvlText w:val=""/>
+      <w:lvlJc w:val="left"/>
+      <w:pPr>
+        <w:tabs>
+          <w:tab w:val="num" w:pos="6480"/>
+        </w:tabs>
+        <w:ind w:left="6480" w:hanging="360"/>
+      </w:pPr>
+      <w:rPr>
+        <w:rFonts w:ascii="Wingdings" w:hAnsi="Wingdings" w:hint="default"/>
+        <w:sz w:val="20"/>
+      </w:rPr>
+    </w:lvl>
+  </w:abstractNum>
+  <w:abstractNum w:abstractNumId="1" w15:restartNumberingAfterBreak="0">
+    <w:nsid w:val="24AC15CF"/>
+    <w:multiLevelType w:val="multilevel"/>
+    <w:tmpl w:val="9F56528C"/>
+    <w:lvl w:ilvl="0">
+      <w:start w:val="1"/>
+      <w:numFmt w:val="bullet"/>
+      <w:lvlText w:val=""/>
+      <w:lvlJc w:val="left"/>
+      <w:pPr>
+        <w:tabs>
+          <w:tab w:val="num" w:pos="720"/>
+        </w:tabs>
+        <w:ind w:left="720" w:hanging="360"/>
+      </w:pPr>
+      <w:rPr>
+        <w:rFonts w:ascii="Symbol" w:hAnsi="Symbol" w:hint="default"/>
+        <w:sz w:val="20"/>
+      </w:rPr>
+    </w:lvl>
+    <w:lvl w:ilvl="1">
+      <w:start w:val="1"/>
+      <w:numFmt w:val="bullet"/>
+      <w:lvlText w:val="o"/>
+      <w:lvlJc w:val="left"/>
+      <w:pPr>
+        <w:tabs>
+          <w:tab w:val="num" w:pos="1440"/>
+        </w:tabs>
+        <w:ind w:left="1440" w:hanging="360"/>
+      </w:pPr>
+      <w:rPr>
+        <w:rFonts w:ascii="Courier New" w:hAnsi="Courier New" w:cs="Times New Roman" w:hint="default"/>
+        <w:sz w:val="20"/>
+      </w:rPr>
+    </w:lvl>
+    <w:lvl w:ilvl="2">
+      <w:start w:val="1"/>
+      <w:numFmt w:val="bullet"/>
+      <w:lvlText w:val=""/>
+      <w:lvlJc w:val="left"/>
+      <w:pPr>
+        <w:tabs>
+          <w:tab w:val="num" w:pos="2160"/>
+        </w:tabs>
+        <w:ind w:left="2160" w:hanging="360"/>
+      </w:pPr>
+      <w:rPr>
+        <w:rFonts w:ascii="Wingdings" w:hAnsi="Wingdings" w:hint="default"/>
+        <w:sz w:val="20"/>
+      </w:rPr>
+    </w:lvl>
+    <w:lvl w:ilvl="3">
+      <w:start w:val="1"/>
+      <w:numFmt w:val="bullet"/>
+      <w:lvlText w:val=""/>
+      <w:lvlJc w:val="left"/>
+      <w:pPr>
+        <w:tabs>
+          <w:tab w:val="num" w:pos="2880"/>
+        </w:tabs>
+        <w:ind w:left="2880" w:hanging="360"/>
+      </w:pPr>
+      <w:rPr>
+        <w:rFonts w:ascii="Wingdings" w:hAnsi="Wingdings" w:hint="default"/>
+        <w:sz w:val="20"/>
+      </w:rPr>
+    </w:lvl>
+    <w:lvl w:ilvl="4">
+      <w:start w:val="1"/>
+      <w:numFmt w:val="bullet"/>
+      <w:lvlText w:val=""/>
+      <w:lvlJc w:val="left"/>
+      <w:pPr>
+        <w:tabs>
+          <w:tab w:val="num" w:pos="3600"/>
+        </w:tabs>
+        <w:ind w:left="3600" w:hanging="360"/>
+      </w:pPr>
+      <w:rPr>
+        <w:rFonts w:ascii="Wingdings" w:hAnsi="Wingdings" w:hint="default"/>
+        <w:sz w:val="20"/>
+      </w:rPr>
+    </w:lvl>
+    <w:lvl w:ilvl="5">
+      <w:start w:val="1"/>
+      <w:numFmt w:val="bullet"/>
+      <w:lvlText w:val=""/>
+      <w:lvlJc w:val="left"/>
+      <w:pPr>
+        <w:tabs>
+          <w:tab w:val="num" w:pos="4320"/>
+        </w:tabs>
+        <w:ind w:left="4320" w:hanging="360"/>
+      </w:pPr>
+      <w:rPr>
+        <w:rFonts w:ascii="Wingdings" w:hAnsi="Wingdings" w:hint="default"/>
+        <w:sz w:val="20"/>
+      </w:rPr>
+    </w:lvl>
+    <w:lvl w:ilvl="6">
+      <w:start w:val="1"/>
+      <w:numFmt w:val="bullet"/>
+      <w:lvlText w:val=""/>
+      <w:lvlJc w:val="left"/>
+      <w:pPr>
+        <w:tabs>
+          <w:tab w:val="num" w:pos="5040"/>
+        </w:tabs>
+        <w:ind w:left="5040" w:hanging="360"/>
+      </w:pPr>
+      <w:rPr>
+        <w:rFonts w:ascii="Wingdings" w:hAnsi="Wingdings" w:hint="default"/>
+        <w:sz w:val="20"/>
+      </w:rPr>
+    </w:lvl>
+    <w:lvl w:ilvl="7">
+      <w:start w:val="1"/>
+      <w:numFmt w:val="bullet"/>
+      <w:lvlText w:val=""/>
+      <w:lvlJc w:val="left"/>
+      <w:pPr>
+        <w:tabs>
+          <w:tab w:val="num" w:pos="5760"/>
+        </w:tabs>
+        <w:ind w:left="5760" w:hanging="360"/>
+      </w:pPr>
+      <w:rPr>
+        <w:rFonts w:ascii="Wingdings" w:hAnsi="Wingdings" w:hint="default"/>
+        <w:sz w:val="20"/>
+      </w:rPr>
+    </w:lvl>
+    <w:lvl w:ilvl="8">
+      <w:start w:val="1"/>
+      <w:numFmt w:val="bullet"/>
+      <w:lvlText w:val=""/>
+      <w:lvlJc w:val="left"/>
+      <w:pPr>
+        <w:tabs>
+          <w:tab w:val="num" w:pos="6480"/>
+        </w:tabs>
+        <w:ind w:left="6480" w:hanging="360"/>
+      </w:pPr>
+      <w:rPr>
+        <w:rFonts w:ascii="Wingdings" w:hAnsi="Wingdings" w:hint="default"/>
+        <w:sz w:val="20"/>
+      </w:rPr>
+    </w:lvl>
+  </w:abstractNum>
+  <w:abstractNum w:abstractNumId="2" w15:restartNumberingAfterBreak="0">
+    <w:nsid w:val="25A679A6"/>
+    <w:multiLevelType w:val="multilevel"/>
+    <w:tmpl w:val="6EFC30E0"/>
+    <w:lvl w:ilvl="0">
+      <w:start w:val="1"/>
+      <w:numFmt w:val="bullet"/>
+      <w:lvlText w:val=""/>
+      <w:lvlJc w:val="left"/>
+      <w:pPr>
+        <w:tabs>
+          <w:tab w:val="num" w:pos="720"/>
+        </w:tabs>
+        <w:ind w:left="720" w:hanging="360"/>
+      </w:pPr>
+      <w:rPr>
+        <w:rFonts w:ascii="Symbol" w:hAnsi="Symbol" w:hint="default"/>
+        <w:sz w:val="20"/>
+      </w:rPr>
+    </w:lvl>
+    <w:lvl w:ilvl="1">
+      <w:start w:val="1"/>
+      <w:numFmt w:val="bullet"/>
+      <w:lvlText w:val="o"/>
+      <w:lvlJc w:val="left"/>
+      <w:pPr>
+        <w:tabs>
+          <w:tab w:val="num" w:pos="1440"/>
+        </w:tabs>
+        <w:ind w:left="1440" w:hanging="360"/>
+      </w:pPr>
+      <w:rPr>
+        <w:rFonts w:ascii="Courier New" w:hAnsi="Courier New" w:cs="Times New Roman" w:hint="default"/>
+        <w:sz w:val="20"/>
+      </w:rPr>
+    </w:lvl>
+    <w:lvl w:ilvl="2">
+      <w:start w:val="1"/>
+      <w:numFmt w:val="bullet"/>
+      <w:lvlText w:val=""/>
+      <w:lvlJc w:val="left"/>
+      <w:pPr>
+        <w:tabs>
+          <w:tab w:val="num" w:pos="2160"/>
+        </w:tabs>
+        <w:ind w:left="2160" w:hanging="360"/>
+      </w:pPr>
+      <w:rPr>
+        <w:rFonts w:ascii="Wingdings" w:hAnsi="Wingdings" w:hint="default"/>
+        <w:sz w:val="20"/>
+      </w:rPr>
+    </w:lvl>
+    <w:lvl w:ilvl="3">
+      <w:start w:val="1"/>
+      <w:numFmt w:val="bullet"/>
+      <w:lvlText w:val=""/>
+      <w:lvlJc w:val="left"/>
+      <w:pPr>
+        <w:tabs>
+          <w:tab w:val="num" w:pos="2880"/>
+        </w:tabs>
+        <w:ind w:left="2880" w:hanging="360"/>
+      </w:pPr>
+      <w:rPr>
+        <w:rFonts w:ascii="Wingdings" w:hAnsi="Wingdings" w:hint="default"/>
+        <w:sz w:val="20"/>
+      </w:rPr>
+    </w:lvl>
+    <w:lvl w:ilvl="4">
+      <w:start w:val="1"/>
+      <w:numFmt w:val="bullet"/>
+      <w:lvlText w:val=""/>
+      <w:lvlJc w:val="left"/>
+      <w:pPr>
+        <w:tabs>
+          <w:tab w:val="num" w:pos="3600"/>
+        </w:tabs>
+        <w:ind w:left="3600" w:hanging="360"/>
+      </w:pPr>
+      <w:rPr>
+        <w:rFonts w:ascii="Wingdings" w:hAnsi="Wingdings" w:hint="default"/>
+        <w:sz w:val="20"/>
+      </w:rPr>
+    </w:lvl>
+    <w:lvl w:ilvl="5">
+      <w:start w:val="1"/>
+      <w:numFmt w:val="bullet"/>
+      <w:lvlText w:val=""/>
+      <w:lvlJc w:val="left"/>
+      <w:pPr>
+        <w:tabs>
+          <w:tab w:val="num" w:pos="4320"/>
+        </w:tabs>
+        <w:ind w:left="4320" w:hanging="360"/>
+      </w:pPr>
+      <w:rPr>
+        <w:rFonts w:ascii="Wingdings" w:hAnsi="Wingdings" w:hint="default"/>
+        <w:sz w:val="20"/>
+      </w:rPr>
+    </w:lvl>
+    <w:lvl w:ilvl="6">
+      <w:start w:val="1"/>
+      <w:numFmt w:val="bullet"/>
+      <w:lvlText w:val=""/>
+      <w:lvlJc w:val="left"/>
+      <w:pPr>
+        <w:tabs>
+          <w:tab w:val="num" w:pos="5040"/>
+        </w:tabs>
+        <w:ind w:left="5040" w:hanging="360"/>
+      </w:pPr>
+      <w:rPr>
+        <w:rFonts w:ascii="Wingdings" w:hAnsi="Wingdings" w:hint="default"/>
+        <w:sz w:val="20"/>
+      </w:rPr>
+    </w:lvl>
+    <w:lvl w:ilvl="7">
+      <w:start w:val="1"/>
+      <w:numFmt w:val="bullet"/>
+      <w:lvlText w:val=""/>
+      <w:lvlJc w:val="left"/>
+      <w:pPr>
+        <w:tabs>
+          <w:tab w:val="num" w:pos="5760"/>
+        </w:tabs>
+        <w:ind w:left="5760" w:hanging="360"/>
+      </w:pPr>
+      <w:rPr>
+        <w:rFonts w:ascii="Wingdings" w:hAnsi="Wingdings" w:hint="default"/>
+        <w:sz w:val="20"/>
+      </w:rPr>
+    </w:lvl>
+    <w:lvl w:ilvl="8">
+      <w:start w:val="1"/>
+      <w:numFmt w:val="bullet"/>
+      <w:lvlText w:val=""/>
+      <w:lvlJc w:val="left"/>
+      <w:pPr>
+        <w:tabs>
+          <w:tab w:val="num" w:pos="6480"/>
+        </w:tabs>
+        <w:ind w:left="6480" w:hanging="360"/>
+      </w:pPr>
+      <w:rPr>
+        <w:rFonts w:ascii="Wingdings" w:hAnsi="Wingdings" w:hint="default"/>
+        <w:sz w:val="20"/>
+      </w:rPr>
+    </w:lvl>
+  </w:abstractNum>
+  <w:abstractNum w:abstractNumId="3" w15:restartNumberingAfterBreak="0">
+    <w:nsid w:val="2AB10200"/>
+    <w:multiLevelType w:val="hybridMultilevel"/>
+    <w:tmpl w:val="7B7EEECE"/>
+    <w:lvl w:ilvl="0" w:tplc="8C60DAAE">
+      <w:start w:val="1"/>
+      <w:numFmt w:val="decimal"/>
+      <w:lvlText w:val="%1."/>
+      <w:lvlJc w:val="center"/>
+      <w:pPr>
+        <w:ind w:left="1080" w:hanging="360"/>
+      </w:pPr>
+      <w:rPr>
+        <w:rFonts w:hint="default"/>
+        <w:b/>
+        <w:i w:val="0"/>
+      </w:rPr>
+    </w:lvl>
+    <w:lvl w:ilvl="1" w:tplc="04240019" w:tentative="1">
+      <w:start w:val="1"/>
+      <w:numFmt w:val="lowerLetter"/>
+      <w:lvlText w:val="%2."/>
+      <w:lvlJc w:val="left"/>
+      <w:pPr>
+        <w:ind w:left="1800" w:hanging="360"/>
+      </w:pPr>
+    </w:lvl>
+    <w:lvl w:ilvl="2" w:tplc="0424001B" w:tentative="1">
+      <w:start w:val="1"/>
+      <w:numFmt w:val="lowerRoman"/>
+      <w:lvlText w:val="%3."/>
+      <w:lvlJc w:val="right"/>
+      <w:pPr>
+        <w:ind w:left="2520" w:hanging="180"/>
+      </w:pPr>
+    </w:lvl>
+    <w:lvl w:ilvl="3" w:tplc="0424000F" w:tentative="1">
+      <w:start w:val="1"/>
+      <w:numFmt w:val="decimal"/>
+      <w:lvlText w:val="%4."/>
+      <w:lvlJc w:val="left"/>
+      <w:pPr>
+        <w:ind w:left="3240" w:hanging="360"/>
+      </w:pPr>
+    </w:lvl>
+    <w:lvl w:ilvl="4" w:tplc="04240019" w:tentative="1">
+      <w:start w:val="1"/>
+      <w:numFmt w:val="lowerLetter"/>
+      <w:lvlText w:val="%5."/>
+      <w:lvlJc w:val="left"/>
+      <w:pPr>
+        <w:ind w:left="3960" w:hanging="360"/>
+      </w:pPr>
+    </w:lvl>
+    <w:lvl w:ilvl="5" w:tplc="0424001B" w:tentative="1">
+      <w:start w:val="1"/>
+      <w:numFmt w:val="lowerRoman"/>
+      <w:lvlText w:val="%6."/>
+      <w:lvlJc w:val="right"/>
+      <w:pPr>
+        <w:ind w:left="4680" w:hanging="180"/>
+      </w:pPr>
+    </w:lvl>
+    <w:lvl w:ilvl="6" w:tplc="0424000F" w:tentative="1">
+      <w:start w:val="1"/>
+      <w:numFmt w:val="decimal"/>
+      <w:lvlText w:val="%7."/>
+      <w:lvlJc w:val="left"/>
+      <w:pPr>
+        <w:ind w:left="5400" w:hanging="360"/>
+      </w:pPr>
+    </w:lvl>
+    <w:lvl w:ilvl="7" w:tplc="04240019" w:tentative="1">
+      <w:start w:val="1"/>
+      <w:numFmt w:val="lowerLetter"/>
+      <w:lvlText w:val="%8."/>
+      <w:lvlJc w:val="left"/>
+      <w:pPr>
+        <w:ind w:left="6120" w:hanging="360"/>
+      </w:pPr>
+    </w:lvl>
+    <w:lvl w:ilvl="8" w:tplc="0424001B" w:tentative="1">
+      <w:start w:val="1"/>
+      <w:numFmt w:val="lowerRoman"/>
+      <w:lvlText w:val="%9."/>
+      <w:lvlJc w:val="right"/>
+      <w:pPr>
+        <w:ind w:left="6840" w:hanging="180"/>
+      </w:pPr>
+    </w:lvl>
+  </w:abstractNum>
+  <w:abstractNum w:abstractNumId="4" w15:restartNumberingAfterBreak="0">
+    <w:nsid w:val="5CFA23B0"/>
+    <w:multiLevelType w:val="multilevel"/>
+    <w:tmpl w:val="9D40204A"/>
+    <w:lvl w:ilvl="0">
+      <w:start w:val="1"/>
+      <w:numFmt w:val="bullet"/>
+      <w:lvlText w:val=""/>
+      <w:lvlJc w:val="left"/>
+      <w:pPr>
+        <w:tabs>
+          <w:tab w:val="num" w:pos="720"/>
+        </w:tabs>
+        <w:ind w:left="720" w:hanging="360"/>
+      </w:pPr>
+      <w:rPr>
+        <w:rFonts w:ascii="Symbol" w:hAnsi="Symbol" w:hint="default"/>
+        <w:sz w:val="20"/>
+      </w:rPr>
+    </w:lvl>
+    <w:lvl w:ilvl="1">
+      <w:start w:val="1"/>
+      <w:numFmt w:val="bullet"/>
+      <w:lvlText w:val="o"/>
+      <w:lvlJc w:val="left"/>
+      <w:pPr>
+        <w:tabs>
+          <w:tab w:val="num" w:pos="1440"/>
+        </w:tabs>
+        <w:ind w:left="1440" w:hanging="360"/>
+      </w:pPr>
+      <w:rPr>
+        <w:rFonts w:ascii="Courier New" w:hAnsi="Courier New" w:cs="Times New Roman" w:hint="default"/>
+        <w:sz w:val="20"/>
+      </w:rPr>
+    </w:lvl>
+    <w:lvl w:ilvl="2">
+      <w:start w:val="1"/>
+      <w:numFmt w:val="bullet"/>
+      <w:lvlText w:val=""/>
+      <w:lvlJc w:val="left"/>
+      <w:pPr>
+        <w:tabs>
+          <w:tab w:val="num" w:pos="2160"/>
+        </w:tabs>
+        <w:ind w:left="2160" w:hanging="360"/>
+      </w:pPr>
+      <w:rPr>
+        <w:rFonts w:ascii="Wingdings" w:hAnsi="Wingdings" w:hint="default"/>
+        <w:sz w:val="20"/>
+      </w:rPr>
+    </w:lvl>
+    <w:lvl w:ilvl="3">
+      <w:start w:val="1"/>
+      <w:numFmt w:val="bullet"/>
+      <w:lvlText w:val=""/>
+      <w:lvlJc w:val="left"/>
+      <w:pPr>
+        <w:tabs>
+          <w:tab w:val="num" w:pos="2880"/>
+        </w:tabs>
+        <w:ind w:left="2880" w:hanging="360"/>
+      </w:pPr>
+      <w:rPr>
+        <w:rFonts w:ascii="Wingdings" w:hAnsi="Wingdings" w:hint="default"/>
+        <w:sz w:val="20"/>
+      </w:rPr>
+    </w:lvl>
+    <w:lvl w:ilvl="4">
+      <w:start w:val="1"/>
+      <w:numFmt w:val="bullet"/>
+      <w:lvlText w:val=""/>
+      <w:lvlJc w:val="left"/>
+      <w:pPr>
+        <w:tabs>
+          <w:tab w:val="num" w:pos="3600"/>
+        </w:tabs>
+        <w:ind w:left="3600" w:hanging="360"/>
+      </w:pPr>
+      <w:rPr>
+        <w:rFonts w:ascii="Wingdings" w:hAnsi="Wingdings" w:hint="default"/>
+        <w:sz w:val="20"/>
+      </w:rPr>
+    </w:lvl>
+    <w:lvl w:ilvl="5">
+      <w:start w:val="1"/>
+      <w:numFmt w:val="bullet"/>
+      <w:lvlText w:val=""/>
+      <w:lvlJc w:val="left"/>
+      <w:pPr>
+        <w:tabs>
+          <w:tab w:val="num" w:pos="4320"/>
+        </w:tabs>
+        <w:ind w:left="4320" w:hanging="360"/>
+      </w:pPr>
+      <w:rPr>
+        <w:rFonts w:ascii="Wingdings" w:hAnsi="Wingdings" w:hint="default"/>
+        <w:sz w:val="20"/>
+      </w:rPr>
+    </w:lvl>
+    <w:lvl w:ilvl="6">
+      <w:start w:val="1"/>
+      <w:numFmt w:val="bullet"/>
+      <w:lvlText w:val=""/>
+      <w:lvlJc w:val="left"/>
+      <w:pPr>
+        <w:tabs>
+          <w:tab w:val="num" w:pos="5040"/>
+        </w:tabs>
+        <w:ind w:left="5040" w:hanging="360"/>
+      </w:pPr>
+      <w:rPr>
+        <w:rFonts w:ascii="Wingdings" w:hAnsi="Wingdings" w:hint="default"/>
+        <w:sz w:val="20"/>
+      </w:rPr>
+    </w:lvl>
+    <w:lvl w:ilvl="7">
+      <w:start w:val="1"/>
+      <w:numFmt w:val="bullet"/>
+      <w:lvlText w:val=""/>
+      <w:lvlJc w:val="left"/>
+      <w:pPr>
+        <w:tabs>
+          <w:tab w:val="num" w:pos="5760"/>
+        </w:tabs>
+        <w:ind w:left="5760" w:hanging="360"/>
+      </w:pPr>
+      <w:rPr>
+        <w:rFonts w:ascii="Wingdings" w:hAnsi="Wingdings" w:hint="default"/>
+        <w:sz w:val="20"/>
+      </w:rPr>
+    </w:lvl>
+    <w:lvl w:ilvl="8">
+      <w:start w:val="1"/>
+      <w:numFmt w:val="bullet"/>
+      <w:lvlText w:val=""/>
+      <w:lvlJc w:val="left"/>
+      <w:pPr>
+        <w:tabs>
+          <w:tab w:val="num" w:pos="6480"/>
+        </w:tabs>
+        <w:ind w:left="6480" w:hanging="360"/>
+      </w:pPr>
+      <w:rPr>
+        <w:rFonts w:ascii="Wingdings" w:hAnsi="Wingdings" w:hint="default"/>
+        <w:sz w:val="20"/>
+      </w:rPr>
+    </w:lvl>
+  </w:abstractNum>
+  <w:abstractNum w:abstractNumId="5" w15:restartNumberingAfterBreak="0">
+    <w:nsid w:val="60CC2E5D"/>
+    <w:multiLevelType w:val="multilevel"/>
+    <w:tmpl w:val="A3520532"/>
+    <w:lvl w:ilvl="0">
+      <w:start w:val="1"/>
+      <w:numFmt w:val="bullet"/>
+      <w:lvlText w:val=""/>
+      <w:lvlJc w:val="left"/>
+      <w:pPr>
+        <w:tabs>
+          <w:tab w:val="num" w:pos="720"/>
+        </w:tabs>
+        <w:ind w:left="720" w:hanging="360"/>
+      </w:pPr>
+      <w:rPr>
+        <w:rFonts w:ascii="Symbol" w:hAnsi="Symbol" w:hint="default"/>
+        <w:sz w:val="20"/>
+      </w:rPr>
+    </w:lvl>
+    <w:lvl w:ilvl="1">
+      <w:start w:val="1"/>
+      <w:numFmt w:val="bullet"/>
+      <w:lvlText w:val="o"/>
+      <w:lvlJc w:val="left"/>
+      <w:pPr>
+        <w:tabs>
+          <w:tab w:val="num" w:pos="1440"/>
+        </w:tabs>
+        <w:ind w:left="1440" w:hanging="360"/>
+      </w:pPr>
+      <w:rPr>
+        <w:rFonts w:ascii="Courier New" w:hAnsi="Courier New" w:cs="Times New Roman" w:hint="default"/>
+        <w:sz w:val="20"/>
+      </w:rPr>
+    </w:lvl>
+    <w:lvl w:ilvl="2">
+      <w:start w:val="1"/>
+      <w:numFmt w:val="bullet"/>
+      <w:lvlText w:val=""/>
+      <w:lvlJc w:val="left"/>
+      <w:pPr>
+        <w:tabs>
+          <w:tab w:val="num" w:pos="2160"/>
+        </w:tabs>
+        <w:ind w:left="2160" w:hanging="360"/>
+      </w:pPr>
+      <w:rPr>
+        <w:rFonts w:ascii="Wingdings" w:hAnsi="Wingdings" w:hint="default"/>
+        <w:sz w:val="20"/>
+      </w:rPr>
+    </w:lvl>
+    <w:lvl w:ilvl="3">
+      <w:start w:val="1"/>
+      <w:numFmt w:val="bullet"/>
+      <w:lvlText w:val=""/>
+      <w:lvlJc w:val="left"/>
+      <w:pPr>
+        <w:tabs>
+          <w:tab w:val="num" w:pos="2880"/>
+        </w:tabs>
+        <w:ind w:left="2880" w:hanging="360"/>
+      </w:pPr>
+      <w:rPr>
+        <w:rFonts w:ascii="Wingdings" w:hAnsi="Wingdings" w:hint="default"/>
+        <w:sz w:val="20"/>
+      </w:rPr>
+    </w:lvl>
+    <w:lvl w:ilvl="4">
+      <w:start w:val="1"/>
+      <w:numFmt w:val="bullet"/>
+      <w:lvlText w:val=""/>
+      <w:lvlJc w:val="left"/>
+      <w:pPr>
+        <w:tabs>
+          <w:tab w:val="num" w:pos="3600"/>
+        </w:tabs>
+        <w:ind w:left="3600" w:hanging="360"/>
+      </w:pPr>
+      <w:rPr>
+        <w:rFonts w:ascii="Wingdings" w:hAnsi="Wingdings" w:hint="default"/>
+        <w:sz w:val="20"/>
+      </w:rPr>
+    </w:lvl>
+    <w:lvl w:ilvl="5">
+      <w:start w:val="1"/>
+      <w:numFmt w:val="bullet"/>
+      <w:lvlText w:val=""/>
+      <w:lvlJc w:val="left"/>
+      <w:pPr>
+        <w:tabs>
+          <w:tab w:val="num" w:pos="4320"/>
+        </w:tabs>
+        <w:ind w:left="4320" w:hanging="360"/>
+      </w:pPr>
+      <w:rPr>
+        <w:rFonts w:ascii="Wingdings" w:hAnsi="Wingdings" w:hint="default"/>
+        <w:sz w:val="20"/>
+      </w:rPr>
+    </w:lvl>
+    <w:lvl w:ilvl="6">
+      <w:start w:val="1"/>
+      <w:numFmt w:val="bullet"/>
+      <w:lvlText w:val=""/>
+      <w:lvlJc w:val="left"/>
+      <w:pPr>
+        <w:tabs>
+          <w:tab w:val="num" w:pos="5040"/>
+        </w:tabs>
+        <w:ind w:left="5040" w:hanging="360"/>
+      </w:pPr>
+      <w:rPr>
+        <w:rFonts w:ascii="Wingdings" w:hAnsi="Wingdings" w:hint="default"/>
+        <w:sz w:val="20"/>
+      </w:rPr>
+    </w:lvl>
+    <w:lvl w:ilvl="7">
+      <w:start w:val="1"/>
+      <w:numFmt w:val="bullet"/>
+      <w:lvlText w:val=""/>
+      <w:lvlJc w:val="left"/>
+      <w:pPr>
+        <w:tabs>
+          <w:tab w:val="num" w:pos="5760"/>
+        </w:tabs>
+        <w:ind w:left="5760" w:hanging="360"/>
+      </w:pPr>
+      <w:rPr>
+        <w:rFonts w:ascii="Wingdings" w:hAnsi="Wingdings" w:hint="default"/>
+        <w:sz w:val="20"/>
+      </w:rPr>
+    </w:lvl>
+    <w:lvl w:ilvl="8">
+      <w:start w:val="1"/>
+      <w:numFmt w:val="bullet"/>
+      <w:lvlText w:val=""/>
+      <w:lvlJc w:val="left"/>
+      <w:pPr>
+        <w:tabs>
+          <w:tab w:val="num" w:pos="6480"/>
+        </w:tabs>
+        <w:ind w:left="6480" w:hanging="360"/>
+      </w:pPr>
+      <w:rPr>
+        <w:rFonts w:ascii="Wingdings" w:hAnsi="Wingdings" w:hint="default"/>
+        <w:sz w:val="20"/>
+      </w:rPr>
+    </w:lvl>
+  </w:abstractNum>
+  <w:abstractNum w:abstractNumId="6" w15:restartNumberingAfterBreak="0">
+    <w:nsid w:val="7640525F"/>
+    <w:multiLevelType w:val="multilevel"/>
+    <w:tmpl w:val="763E8354"/>
+    <w:lvl w:ilvl="0">
+      <w:start w:val="1"/>
+      <w:numFmt w:val="bullet"/>
+      <w:lvlText w:val=""/>
+      <w:lvlJc w:val="left"/>
+      <w:pPr>
+        <w:tabs>
+          <w:tab w:val="num" w:pos="720"/>
+        </w:tabs>
+        <w:ind w:left="720" w:hanging="360"/>
+      </w:pPr>
+      <w:rPr>
+        <w:rFonts w:ascii="Symbol" w:hAnsi="Symbol" w:hint="default"/>
+        <w:sz w:val="20"/>
+      </w:rPr>
+    </w:lvl>
+    <w:lvl w:ilvl="1">
+      <w:start w:val="1"/>
+      <w:numFmt w:val="bullet"/>
+      <w:lvlText w:val="o"/>
+      <w:lvlJc w:val="left"/>
+      <w:pPr>
+        <w:tabs>
+          <w:tab w:val="num" w:pos="1440"/>
+        </w:tabs>
+        <w:ind w:left="1440" w:hanging="360"/>
+      </w:pPr>
+      <w:rPr>
+        <w:rFonts w:ascii="Courier New" w:hAnsi="Courier New" w:cs="Times New Roman" w:hint="default"/>
+        <w:sz w:val="20"/>
+      </w:rPr>
+    </w:lvl>
+    <w:lvl w:ilvl="2">
+      <w:start w:val="1"/>
+      <w:numFmt w:val="bullet"/>
+      <w:lvlText w:val=""/>
+      <w:lvlJc w:val="left"/>
+      <w:pPr>
+        <w:tabs>
+          <w:tab w:val="num" w:pos="2160"/>
+        </w:tabs>
+        <w:ind w:left="2160" w:hanging="360"/>
+      </w:pPr>
+      <w:rPr>
+        <w:rFonts w:ascii="Wingdings" w:hAnsi="Wingdings" w:hint="default"/>
+        <w:sz w:val="20"/>
+      </w:rPr>
+    </w:lvl>
+    <w:lvl w:ilvl="3">
+      <w:start w:val="1"/>
+      <w:numFmt w:val="bullet"/>
+      <w:lvlText w:val=""/>
+      <w:lvlJc w:val="left"/>
+      <w:pPr>
+        <w:tabs>
+          <w:tab w:val="num" w:pos="2880"/>
+        </w:tabs>
+        <w:ind w:left="2880" w:hanging="360"/>
+      </w:pPr>
+      <w:rPr>
+        <w:rFonts w:ascii="Wingdings" w:hAnsi="Wingdings" w:hint="default"/>
+        <w:sz w:val="20"/>
+      </w:rPr>
+    </w:lvl>
+    <w:lvl w:ilvl="4">
+      <w:start w:val="1"/>
+      <w:numFmt w:val="bullet"/>
+      <w:lvlText w:val=""/>
+      <w:lvlJc w:val="left"/>
+      <w:pPr>
+        <w:tabs>
+          <w:tab w:val="num" w:pos="3600"/>
+        </w:tabs>
+        <w:ind w:left="3600" w:hanging="360"/>
+      </w:pPr>
+      <w:rPr>
+        <w:rFonts w:ascii="Wingdings" w:hAnsi="Wingdings" w:hint="default"/>
+        <w:sz w:val="20"/>
+      </w:rPr>
+    </w:lvl>
+    <w:lvl w:ilvl="5">
+      <w:start w:val="1"/>
+      <w:numFmt w:val="bullet"/>
+      <w:lvlText w:val=""/>
+      <w:lvlJc w:val="left"/>
+      <w:pPr>
+        <w:tabs>
+          <w:tab w:val="num" w:pos="4320"/>
+        </w:tabs>
+        <w:ind w:left="4320" w:hanging="360"/>
+      </w:pPr>
+      <w:rPr>
+        <w:rFonts w:ascii="Wingdings" w:hAnsi="Wingdings" w:hint="default"/>
+        <w:sz w:val="20"/>
+      </w:rPr>
+    </w:lvl>
+    <w:lvl w:ilvl="6">
+      <w:start w:val="1"/>
+      <w:numFmt w:val="bullet"/>
+      <w:lvlText w:val=""/>
+      <w:lvlJc w:val="left"/>
+      <w:pPr>
+        <w:tabs>
+          <w:tab w:val="num" w:pos="5040"/>
+        </w:tabs>
+        <w:ind w:left="5040" w:hanging="360"/>
+      </w:pPr>
+      <w:rPr>
+        <w:rFonts w:ascii="Wingdings" w:hAnsi="Wingdings" w:hint="default"/>
+        <w:sz w:val="20"/>
+      </w:rPr>
+    </w:lvl>
+    <w:lvl w:ilvl="7">
+      <w:start w:val="1"/>
+      <w:numFmt w:val="bullet"/>
+      <w:lvlText w:val=""/>
+      <w:lvlJc w:val="left"/>
+      <w:pPr>
+        <w:tabs>
+          <w:tab w:val="num" w:pos="5760"/>
+        </w:tabs>
+        <w:ind w:left="5760" w:hanging="360"/>
+      </w:pPr>
+      <w:rPr>
+        <w:rFonts w:ascii="Wingdings" w:hAnsi="Wingdings" w:hint="default"/>
+        <w:sz w:val="20"/>
+      </w:rPr>
+    </w:lvl>
+    <w:lvl w:ilvl="8">
+      <w:start w:val="1"/>
+      <w:numFmt w:val="bullet"/>
+      <w:lvlText w:val=""/>
+      <w:lvlJc w:val="left"/>
+      <w:pPr>
+        <w:tabs>
+          <w:tab w:val="num" w:pos="6480"/>
+        </w:tabs>
+        <w:ind w:left="6480" w:hanging="360"/>
+      </w:pPr>
+      <w:rPr>
+        <w:rFonts w:ascii="Wingdings" w:hAnsi="Wingdings" w:hint="default"/>
+        <w:sz w:val="20"/>
+      </w:rPr>
+    </w:lvl>
+  </w:abstractNum>
+  <w:abstractNum w:abstractNumId="7" w15:restartNumberingAfterBreak="0">
+    <w:nsid w:val="7C0B0D70"/>
+    <w:multiLevelType w:val="hybridMultilevel"/>
+    <w:tmpl w:val="84FC1C46"/>
+    <w:lvl w:ilvl="0" w:tplc="8C60DAAE">
+      <w:start w:val="1"/>
+      <w:numFmt w:val="decimal"/>
+      <w:lvlText w:val="%1."/>
+      <w:lvlJc w:val="center"/>
+      <w:pPr>
+        <w:ind w:left="720" w:hanging="360"/>
+      </w:pPr>
+      <w:rPr>
+        <w:rFonts w:hint="default"/>
+        <w:b/>
+        <w:i w:val="0"/>
+      </w:rPr>
+    </w:lvl>
+    <w:lvl w:ilvl="1" w:tplc="04240019" w:tentative="1">
+      <w:start w:val="1"/>
+      <w:numFmt w:val="lowerLetter"/>
+      <w:lvlText w:val="%2."/>
+      <w:lvlJc w:val="left"/>
+      <w:pPr>
+        <w:ind w:left="1440" w:hanging="360"/>
+      </w:pPr>
+    </w:lvl>
+    <w:lvl w:ilvl="2" w:tplc="0424001B" w:tentative="1">
+      <w:start w:val="1"/>
+      <w:numFmt w:val="lowerRoman"/>
+      <w:lvlText w:val="%3."/>
+      <w:lvlJc w:val="right"/>
+      <w:pPr>
+        <w:ind w:left="2160" w:hanging="180"/>
+      </w:pPr>
+    </w:lvl>
+    <w:lvl w:ilvl="3" w:tplc="0424000F" w:tentative="1">
+      <w:start w:val="1"/>
+      <w:numFmt w:val="decimal"/>
+      <w:lvlText w:val="%4."/>
+      <w:lvlJc w:val="left"/>
+      <w:pPr>
+        <w:ind w:left="2880" w:hanging="360"/>
+      </w:pPr>
+    </w:lvl>
+    <w:lvl w:ilvl="4" w:tplc="04240019" w:tentative="1">
+      <w:start w:val="1"/>
+      <w:numFmt w:val="lowerLetter"/>
+      <w:lvlText w:val="%5."/>
+      <w:lvlJc w:val="left"/>
+      <w:pPr>
+        <w:ind w:left="3600" w:hanging="360"/>
+      </w:pPr>
+    </w:lvl>
+    <w:lvl w:ilvl="5" w:tplc="0424001B" w:tentative="1">
+      <w:start w:val="1"/>
+      <w:numFmt w:val="lowerRoman"/>
+      <w:lvlText w:val="%6."/>
+      <w:lvlJc w:val="right"/>
+      <w:pPr>
+        <w:ind w:left="4320" w:hanging="180"/>
+      </w:pPr>
+    </w:lvl>
+    <w:lvl w:ilvl="6" w:tplc="0424000F" w:tentative="1">
+      <w:start w:val="1"/>
+      <w:numFmt w:val="decimal"/>
+      <w:lvlText w:val="%7."/>
+      <w:lvlJc w:val="left"/>
+      <w:pPr>
+        <w:ind w:left="5040" w:hanging="360"/>
+      </w:pPr>
+    </w:lvl>
+    <w:lvl w:ilvl="7" w:tplc="04240019" w:tentative="1">
+      <w:start w:val="1"/>
+      <w:numFmt w:val="lowerLetter"/>
+      <w:lvlText w:val="%8."/>
+      <w:lvlJc w:val="left"/>
+      <w:pPr>
+        <w:ind w:left="5760" w:hanging="360"/>
+      </w:pPr>
+    </w:lvl>
+    <w:lvl w:ilvl="8" w:tplc="0424001B" w:tentative="1">
+      <w:start w:val="1"/>
+      <w:numFmt w:val="lowerRoman"/>
+      <w:lvlText w:val="%9."/>
+      <w:lvlJc w:val="right"/>
+      <w:pPr>
+        <w:ind w:left="6480" w:hanging="180"/>
+      </w:pPr>
+    </w:lvl>
+  </w:abstractNum>
+  <w:abstractNum w:abstractNumId="8" w15:restartNumberingAfterBreak="0">
+    <w:nsid w:val="7D230181"/>
+    <w:multiLevelType w:val="hybridMultilevel"/>
+    <w:tmpl w:val="43A09E2A"/>
+    <w:lvl w:ilvl="0" w:tplc="0424000F">
+      <w:start w:val="1"/>
+      <w:numFmt w:val="decimal"/>
+      <w:lvlText w:val="%1."/>
+      <w:lvlJc w:val="left"/>
+      <w:pPr>
+        <w:ind w:left="720" w:hanging="360"/>
+      </w:pPr>
+      <w:rPr>
+        <w:rFonts w:hint="default"/>
+      </w:rPr>
+    </w:lvl>
+    <w:lvl w:ilvl="1" w:tplc="04240019" w:tentative="1">
+      <w:start w:val="1"/>
+      <w:numFmt w:val="lowerLetter"/>
+      <w:lvlText w:val="%2."/>
+      <w:lvlJc w:val="left"/>
+      <w:pPr>
+        <w:ind w:left="1440" w:hanging="360"/>
+      </w:pPr>
+    </w:lvl>
+    <w:lvl w:ilvl="2" w:tplc="0424001B" w:tentative="1">
+      <w:start w:val="1"/>
+      <w:numFmt w:val="lowerRoman"/>
+      <w:lvlText w:val="%3."/>
+      <w:lvlJc w:val="right"/>
+      <w:pPr>
+        <w:ind w:left="2160" w:hanging="180"/>
+      </w:pPr>
+    </w:lvl>
+    <w:lvl w:ilvl="3" w:tplc="0424000F" w:tentative="1">
+      <w:start w:val="1"/>
+      <w:numFmt w:val="decimal"/>
+      <w:lvlText w:val="%4."/>
+      <w:lvlJc w:val="left"/>
+      <w:pPr>
+        <w:ind w:left="2880" w:hanging="360"/>
+      </w:pPr>
+    </w:lvl>
+    <w:lvl w:ilvl="4" w:tplc="04240019" w:tentative="1">
+      <w:start w:val="1"/>
+      <w:numFmt w:val="lowerLetter"/>
+      <w:lvlText w:val="%5."/>
+      <w:lvlJc w:val="left"/>
+      <w:pPr>
+        <w:ind w:left="3600" w:hanging="360"/>
+      </w:pPr>
+    </w:lvl>
+    <w:lvl w:ilvl="5" w:tplc="0424001B" w:tentative="1">
+      <w:start w:val="1"/>
+      <w:numFmt w:val="lowerRoman"/>
+      <w:lvlText w:val="%6."/>
+      <w:lvlJc w:val="right"/>
+      <w:pPr>
+        <w:ind w:left="4320" w:hanging="180"/>
+      </w:pPr>
+    </w:lvl>
+    <w:lvl w:ilvl="6" w:tplc="0424000F" w:tentative="1">
+      <w:start w:val="1"/>
+      <w:numFmt w:val="decimal"/>
+      <w:lvlText w:val="%7."/>
+      <w:lvlJc w:val="left"/>
+      <w:pPr>
+        <w:ind w:left="5040" w:hanging="360"/>
+      </w:pPr>
+    </w:lvl>
+    <w:lvl w:ilvl="7" w:tplc="04240019" w:tentative="1">
+      <w:start w:val="1"/>
+      <w:numFmt w:val="lowerLetter"/>
+      <w:lvlText w:val="%8."/>
+      <w:lvlJc w:val="left"/>
+      <w:pPr>
+        <w:ind w:left="5760" w:hanging="360"/>
+      </w:pPr>
+    </w:lvl>
+    <w:lvl w:ilvl="8" w:tplc="0424001B" w:tentative="1">
+      <w:start w:val="1"/>
+      <w:numFmt w:val="lowerRoman"/>
+      <w:lvlText w:val="%9."/>
+      <w:lvlJc w:val="right"/>
+      <w:pPr>
+        <w:ind w:left="6480" w:hanging="180"/>
+      </w:pPr>
+    </w:lvl>
+  </w:abstractNum>
+  <w:num w:numId="1" w16cid:durableId="1315986288">
+    <w:abstractNumId w:val="6"/>
+    <w:lvlOverride w:ilvl="0"/>
+    <w:lvlOverride w:ilvl="1"/>
+    <w:lvlOverride w:ilvl="2"/>
+    <w:lvlOverride w:ilvl="3"/>
+    <w:lvlOverride w:ilvl="4"/>
+    <w:lvlOverride w:ilvl="5"/>
+    <w:lvlOverride w:ilvl="6"/>
+    <w:lvlOverride w:ilvl="7"/>
+    <w:lvlOverride w:ilvl="8"/>
+  </w:num>
+  <w:num w:numId="2" w16cid:durableId="299575243">
+    <w:abstractNumId w:val="5"/>
+    <w:lvlOverride w:ilvl="0"/>
+    <w:lvlOverride w:ilvl="1"/>
+    <w:lvlOverride w:ilvl="2"/>
+    <w:lvlOverride w:ilvl="3"/>
+    <w:lvlOverride w:ilvl="4"/>
+    <w:lvlOverride w:ilvl="5"/>
+    <w:lvlOverride w:ilvl="6"/>
+    <w:lvlOverride w:ilvl="7"/>
+    <w:lvlOverride w:ilvl="8"/>
+  </w:num>
+  <w:num w:numId="3" w16cid:durableId="1378511311">
+    <w:abstractNumId w:val="0"/>
+    <w:lvlOverride w:ilvl="0"/>
+    <w:lvlOverride w:ilvl="1"/>
+    <w:lvlOverride w:ilvl="2"/>
+    <w:lvlOverride w:ilvl="3"/>
+    <w:lvlOverride w:ilvl="4"/>
+    <w:lvlOverride w:ilvl="5"/>
+    <w:lvlOverride w:ilvl="6"/>
+    <w:lvlOverride w:ilvl="7"/>
+    <w:lvlOverride w:ilvl="8"/>
+  </w:num>
+  <w:num w:numId="4" w16cid:durableId="2133160071">
+    <w:abstractNumId w:val="1"/>
+    <w:lvlOverride w:ilvl="0"/>
+    <w:lvlOverride w:ilvl="1"/>
+    <w:lvlOverride w:ilvl="2"/>
+    <w:lvlOverride w:ilvl="3"/>
+    <w:lvlOverride w:ilvl="4"/>
+    <w:lvlOverride w:ilvl="5"/>
+    <w:lvlOverride w:ilvl="6"/>
+    <w:lvlOverride w:ilvl="7"/>
+    <w:lvlOverride w:ilvl="8"/>
+  </w:num>
+  <w:num w:numId="5" w16cid:durableId="2095322701">
+    <w:abstractNumId w:val="2"/>
+    <w:lvlOverride w:ilvl="0"/>
+    <w:lvlOverride w:ilvl="1"/>
+    <w:lvlOverride w:ilvl="2"/>
+    <w:lvlOverride w:ilvl="3"/>
+    <w:lvlOverride w:ilvl="4"/>
+    <w:lvlOverride w:ilvl="5"/>
+    <w:lvlOverride w:ilvl="6"/>
+    <w:lvlOverride w:ilvl="7"/>
+    <w:lvlOverride w:ilvl="8"/>
+  </w:num>
+  <w:num w:numId="6" w16cid:durableId="1875535588">
+    <w:abstractNumId w:val="4"/>
+    <w:lvlOverride w:ilvl="0"/>
+    <w:lvlOverride w:ilvl="1"/>
+    <w:lvlOverride w:ilvl="2"/>
+    <w:lvlOverride w:ilvl="3"/>
+    <w:lvlOverride w:ilvl="4"/>
+    <w:lvlOverride w:ilvl="5"/>
+    <w:lvlOverride w:ilvl="6"/>
+    <w:lvlOverride w:ilvl="7"/>
+    <w:lvlOverride w:ilvl="8"/>
+  </w:num>
+  <w:num w:numId="7" w16cid:durableId="487941223">
+    <w:abstractNumId w:val="8"/>
+  </w:num>
+  <w:num w:numId="8" w16cid:durableId="308095525">
+    <w:abstractNumId w:val="7"/>
+  </w:num>
+  <w:num w:numId="9" w16cid:durableId="411664179">
+    <w:abstractNumId w:val="3"/>
+  </w:num>
+</w:numbering>
 </file>
 
 <file path=word/styles.xml><?xml version="1.0" encoding="utf-8"?>

</xml_diff>